<commit_message>
final version of paper
</commit_message>
<xml_diff>
--- a/paper/CNN_vs_Fox.docx
+++ b/paper/CNN_vs_Fox.docx
@@ -21,7 +21,27 @@
           <w:sz w:val="32"/>
           <w:szCs w:val="32"/>
         </w:rPr>
-        <w:t>How different news outlets see economic conditions: CNN vs Fox News</w:t>
+        <w:t xml:space="preserve">How </w:t>
+      </w:r>
+      <w:r>
+        <w:rPr>
+          <w:rFonts w:ascii="Times New Roman" w:hAnsi="Times New Roman" w:cs="Times New Roman"/>
+          <w:b/>
+          <w:bCs/>
+          <w:sz w:val="32"/>
+          <w:szCs w:val="32"/>
+        </w:rPr>
+        <w:t>Conservative and Liberal News Media See Current Economic Condition</w:t>
+      </w:r>
+      <w:r>
+        <w:rPr>
+          <w:rFonts w:ascii="Times New Roman" w:hAnsi="Times New Roman" w:cs="Times New Roman"/>
+          <w:b/>
+          <w:bCs/>
+          <w:sz w:val="32"/>
+          <w:szCs w:val="32"/>
+        </w:rPr>
+        <w:t>: CNN vs Fox News</w:t>
       </w:r>
     </w:p>
     <w:p>
@@ -44,6 +64,10 @@
     <w:p>
       <w:pPr>
         <w:pStyle w:val="Heading1"/>
+        <w:numPr>
+          <w:ilvl w:val="0"/>
+          <w:numId w:val="15"/>
+        </w:numPr>
       </w:pPr>
       <w:r>
         <w:t>Introduction</w:t>
@@ -56,41 +80,72 @@
           <w:rFonts w:ascii="Times New Roman" w:hAnsi="Times New Roman" w:cs="Times New Roman"/>
           <w:sz w:val="24"/>
           <w:szCs w:val="24"/>
-        </w:rPr>
-      </w:pPr>
-      <w:r>
-        <w:rPr>
-          <w:rFonts w:ascii="Times New Roman" w:hAnsi="Times New Roman" w:cs="Times New Roman"/>
-          <w:sz w:val="24"/>
-          <w:szCs w:val="24"/>
-        </w:rPr>
-        <w:t>This study examines how liberal- and conservative-leaning news media portray U.S. economic conditions, using CNN and Fox News as comparative case studies. While both outlets report on the same macroeconomic indicators, their linguistic framing and tone may differ in systematic ways.</w:t>
+          <w:lang w:val="mn-MN"/>
+        </w:rPr>
+      </w:pPr>
+      <w:r>
+        <w:rPr>
+          <w:rFonts w:ascii="Times New Roman" w:hAnsi="Times New Roman" w:cs="Times New Roman"/>
+          <w:sz w:val="24"/>
+          <w:szCs w:val="24"/>
+        </w:rPr>
+        <w:t xml:space="preserve">Consumer confidence plays a significant role in shaping economic outcomes, and news media are among the most influential factors affecting consumer perceptions of the economy. This study examines how liberal- and conservative-leaning news outlets portray U.S. economic conditions in 2025, using CNN and Fox News as comparative case studies. </w:t>
+      </w:r>
+      <w:r>
+        <w:rPr>
+          <w:rFonts w:ascii="Times New Roman" w:hAnsi="Times New Roman" w:cs="Times New Roman"/>
+          <w:sz w:val="24"/>
+          <w:szCs w:val="24"/>
+        </w:rPr>
+        <w:t xml:space="preserve">To identify difference in coverage, the analysis employs bigram frequency analysis with log-odds ratio to compare thematic emphasis across outlets, and the AFINN lexicon to measure article-level sentiment. The study further investigates how sentiment varies across economic categories, its relationship with U.S. GDP growth, and the role of political references in shaping the tone of economic reporting. </w:t>
       </w:r>
     </w:p>
     <w:p>
       <w:pPr>
-        <w:jc w:val="both"/>
-        <w:rPr>
-          <w:rFonts w:ascii="Times New Roman" w:hAnsi="Times New Roman" w:cs="Times New Roman"/>
-          <w:sz w:val="24"/>
-          <w:szCs w:val="24"/>
-        </w:rPr>
-      </w:pPr>
-      <w:r>
-        <w:rPr>
-          <w:rFonts w:ascii="Times New Roman" w:hAnsi="Times New Roman" w:cs="Times New Roman"/>
-          <w:sz w:val="24"/>
-          <w:szCs w:val="24"/>
-        </w:rPr>
-        <w:t>To analyze these differences, the study applies text-as-data methods to economic news articles. Bigram frequency analysis and log-odds ratios are used to compare thematic emphasis, while article-level sentiment is measured using the AFINN lexicon. The analysis further examines sentiment variation across economic categories, its relationship with U.S. GDP growth, and the role of political references—particularly mentions of Donald Trump—in shaping economic tone.</w:t>
+        <w:pStyle w:val="Heading1"/>
+        <w:numPr>
+          <w:ilvl w:val="0"/>
+          <w:numId w:val="15"/>
+        </w:numPr>
+      </w:pPr>
+      <w:r>
+        <w:t>Data</w:t>
       </w:r>
     </w:p>
     <w:p>
       <w:pPr>
-        <w:pStyle w:val="Heading1"/>
-      </w:pPr>
-      <w:r>
-        <w:t>Data</w:t>
+        <w:jc w:val="both"/>
+        <w:rPr>
+          <w:rFonts w:ascii="Times New Roman" w:hAnsi="Times New Roman" w:cs="Times New Roman"/>
+          <w:sz w:val="24"/>
+          <w:szCs w:val="24"/>
+        </w:rPr>
+      </w:pPr>
+      <w:r>
+        <w:rPr>
+          <w:rFonts w:ascii="Times New Roman" w:hAnsi="Times New Roman" w:cs="Times New Roman"/>
+          <w:sz w:val="24"/>
+          <w:szCs w:val="24"/>
+        </w:rPr>
+        <w:t xml:space="preserve">Economic news articles were scraped directly from the CNN and Fox News website. The data collection process used Python’s Selenium and </w:t>
+      </w:r>
+      <w:proofErr w:type="spellStart"/>
+      <w:r>
+        <w:rPr>
+          <w:rFonts w:ascii="Times New Roman" w:hAnsi="Times New Roman" w:cs="Times New Roman"/>
+          <w:sz w:val="24"/>
+          <w:szCs w:val="24"/>
+        </w:rPr>
+        <w:t>BeautifulSoup</w:t>
+      </w:r>
+      <w:proofErr w:type="spellEnd"/>
+      <w:r>
+        <w:rPr>
+          <w:rFonts w:ascii="Times New Roman" w:hAnsi="Times New Roman" w:cs="Times New Roman"/>
+          <w:sz w:val="24"/>
+          <w:szCs w:val="24"/>
+        </w:rPr>
+        <w:t xml:space="preserve"> libraries. The scraping procedure consisted of two main stages. First, article links returned by search engines were collected. Second, full news articles were scraped individually using these links. </w:t>
       </w:r>
     </w:p>
     <w:p>
@@ -108,48 +163,16 @@
           <w:sz w:val="24"/>
           <w:szCs w:val="24"/>
         </w:rPr>
-        <w:t xml:space="preserve">Economic-related news articles were scraped directly from the CNN and Fox News website. The data collection process used Python’s Selenium and </w:t>
-      </w:r>
-      <w:proofErr w:type="spellStart"/>
-      <w:r>
-        <w:rPr>
-          <w:rFonts w:ascii="Times New Roman" w:hAnsi="Times New Roman" w:cs="Times New Roman"/>
-          <w:sz w:val="24"/>
-          <w:szCs w:val="24"/>
-        </w:rPr>
-        <w:t>BeautifulSoup</w:t>
-      </w:r>
-      <w:proofErr w:type="spellEnd"/>
-      <w:r>
-        <w:rPr>
-          <w:rFonts w:ascii="Times New Roman" w:hAnsi="Times New Roman" w:cs="Times New Roman"/>
-          <w:sz w:val="24"/>
-          <w:szCs w:val="24"/>
-        </w:rPr>
-        <w:t xml:space="preserve"> libraries. The scraping procedure consisted of two main stages. First, article links returned by search engines were collected. Second, full news articles were scraped individually using these links. </w:t>
+        <w:t xml:space="preserve">For CNN, searches were conducted using 41 economic-related keywords, and all resulting articles were scraped. For Fox News, all articles published in 2025 under the U.S. Economy category were collected. For the analysis, 646 articles from CNN and 756 articles from Fox News were retained and used. </w:t>
       </w:r>
     </w:p>
     <w:p>
       <w:pPr>
-        <w:jc w:val="both"/>
-        <w:rPr>
-          <w:rFonts w:ascii="Times New Roman" w:hAnsi="Times New Roman" w:cs="Times New Roman"/>
-          <w:sz w:val="24"/>
-          <w:szCs w:val="24"/>
-        </w:rPr>
-      </w:pPr>
-      <w:r>
-        <w:rPr>
-          <w:rFonts w:ascii="Times New Roman" w:hAnsi="Times New Roman" w:cs="Times New Roman"/>
-          <w:sz w:val="24"/>
-          <w:szCs w:val="24"/>
-        </w:rPr>
-        <w:t xml:space="preserve">For CNN, searches were conducted using 41 economic-related keywords, and all resulting articles were scraped. For Fox News, all articles published in 2025 under the U.S. Economy category were collected. For the analysis, 646 articles from CNN and 756 articles from Fox News were retained and used. </w:t>
-      </w:r>
-    </w:p>
-    <w:p>
-      <w:pPr>
         <w:pStyle w:val="Heading1"/>
+        <w:numPr>
+          <w:ilvl w:val="0"/>
+          <w:numId w:val="15"/>
+        </w:numPr>
       </w:pPr>
       <w:r>
         <w:t xml:space="preserve">Methods </w:t>
@@ -194,7 +217,7 @@
         <w:pStyle w:val="ListParagraph"/>
         <w:numPr>
           <w:ilvl w:val="0"/>
-          <w:numId w:val="1"/>
+          <w:numId w:val="16"/>
         </w:numPr>
         <w:jc w:val="both"/>
         <w:rPr>
@@ -456,7 +479,7 @@
         <w:pStyle w:val="ListParagraph"/>
         <w:numPr>
           <w:ilvl w:val="0"/>
-          <w:numId w:val="1"/>
+          <w:numId w:val="16"/>
         </w:numPr>
         <w:jc w:val="both"/>
         <w:rPr>
@@ -1416,7 +1439,7 @@
         <w:pStyle w:val="ListParagraph"/>
         <w:numPr>
           <w:ilvl w:val="0"/>
-          <w:numId w:val="1"/>
+          <w:numId w:val="16"/>
         </w:numPr>
         <w:jc w:val="both"/>
         <w:rPr>
@@ -1520,7 +1543,703 @@
     </w:p>
     <w:p>
       <w:pPr>
+        <w:pStyle w:val="Caption"/>
+        <w:rPr>
+          <w:rFonts w:cs="Times New Roman"/>
+          <w:sz w:val="24"/>
+          <w:szCs w:val="24"/>
+        </w:rPr>
+      </w:pPr>
+      <w:r>
+        <w:t xml:space="preserve">Table </w:t>
+      </w:r>
+      <w:fldSimple w:instr=" SEQ Table \* ARABIC ">
+        <w:r>
+          <w:rPr>
+            <w:noProof/>
+          </w:rPr>
+          <w:t>1</w:t>
+        </w:r>
+      </w:fldSimple>
+      <w:r>
+        <w:t>. Example words from AFINN-165</w:t>
+      </w:r>
+    </w:p>
+    <w:tbl>
+      <w:tblPr>
+        <w:tblStyle w:val="PlainTable2"/>
+        <w:tblW w:w="0" w:type="auto"/>
+        <w:tblLook w:val="04A0" w:firstRow="1" w:lastRow="0" w:firstColumn="1" w:lastColumn="0" w:noHBand="0" w:noVBand="1"/>
+      </w:tblPr>
+      <w:tblGrid>
+        <w:gridCol w:w="2394"/>
+        <w:gridCol w:w="2394"/>
+        <w:gridCol w:w="2394"/>
+        <w:gridCol w:w="2394"/>
+      </w:tblGrid>
+      <w:tr>
+        <w:trPr>
+          <w:cnfStyle w:val="100000000000" w:firstRow="1" w:lastRow="0" w:firstColumn="0" w:lastColumn="0" w:oddVBand="0" w:evenVBand="0" w:oddHBand="0" w:evenHBand="0" w:firstRowFirstColumn="0" w:firstRowLastColumn="0" w:lastRowFirstColumn="0" w:lastRowLastColumn="0"/>
+        </w:trPr>
+        <w:tc>
+          <w:tcPr>
+            <w:cnfStyle w:val="001000000000" w:firstRow="0" w:lastRow="0" w:firstColumn="1" w:lastColumn="0" w:oddVBand="0" w:evenVBand="0" w:oddHBand="0" w:evenHBand="0" w:firstRowFirstColumn="0" w:firstRowLastColumn="0" w:lastRowFirstColumn="0" w:lastRowLastColumn="0"/>
+            <w:tcW w:w="2394" w:type="dxa"/>
+          </w:tcPr>
+          <w:p>
+            <w:pPr>
+              <w:jc w:val="center"/>
+              <w:rPr>
+                <w:rFonts w:ascii="Times New Roman" w:hAnsi="Times New Roman" w:cs="Times New Roman"/>
+                <w:b w:val="0"/>
+                <w:bCs w:val="0"/>
+                <w:sz w:val="24"/>
+                <w:szCs w:val="24"/>
+              </w:rPr>
+            </w:pPr>
+            <w:r>
+              <w:rPr>
+                <w:rFonts w:ascii="Times New Roman" w:hAnsi="Times New Roman" w:cs="Times New Roman"/>
+                <w:b w:val="0"/>
+                <w:bCs w:val="0"/>
+                <w:sz w:val="24"/>
+                <w:szCs w:val="24"/>
+              </w:rPr>
+              <w:t>Word</w:t>
+            </w:r>
+          </w:p>
+        </w:tc>
+        <w:tc>
+          <w:tcPr>
+            <w:tcW w:w="2394" w:type="dxa"/>
+          </w:tcPr>
+          <w:p>
+            <w:pPr>
+              <w:jc w:val="center"/>
+              <w:cnfStyle w:val="100000000000" w:firstRow="1" w:lastRow="0" w:firstColumn="0" w:lastColumn="0" w:oddVBand="0" w:evenVBand="0" w:oddHBand="0" w:evenHBand="0" w:firstRowFirstColumn="0" w:firstRowLastColumn="0" w:lastRowFirstColumn="0" w:lastRowLastColumn="0"/>
+              <w:rPr>
+                <w:rFonts w:ascii="Times New Roman" w:hAnsi="Times New Roman" w:cs="Times New Roman"/>
+                <w:b w:val="0"/>
+                <w:bCs w:val="0"/>
+                <w:sz w:val="24"/>
+                <w:szCs w:val="24"/>
+              </w:rPr>
+            </w:pPr>
+            <w:r>
+              <w:rPr>
+                <w:rFonts w:ascii="Times New Roman" w:hAnsi="Times New Roman" w:cs="Times New Roman"/>
+                <w:b w:val="0"/>
+                <w:bCs w:val="0"/>
+                <w:sz w:val="24"/>
+                <w:szCs w:val="24"/>
+              </w:rPr>
+              <w:t>Sentiment Score</w:t>
+            </w:r>
+          </w:p>
+        </w:tc>
+        <w:tc>
+          <w:tcPr>
+            <w:tcW w:w="2394" w:type="dxa"/>
+          </w:tcPr>
+          <w:p>
+            <w:pPr>
+              <w:jc w:val="center"/>
+              <w:cnfStyle w:val="100000000000" w:firstRow="1" w:lastRow="0" w:firstColumn="0" w:lastColumn="0" w:oddVBand="0" w:evenVBand="0" w:oddHBand="0" w:evenHBand="0" w:firstRowFirstColumn="0" w:firstRowLastColumn="0" w:lastRowFirstColumn="0" w:lastRowLastColumn="0"/>
+              <w:rPr>
+                <w:rFonts w:ascii="Times New Roman" w:hAnsi="Times New Roman" w:cs="Times New Roman"/>
+                <w:b w:val="0"/>
+                <w:bCs w:val="0"/>
+                <w:sz w:val="24"/>
+                <w:szCs w:val="24"/>
+              </w:rPr>
+            </w:pPr>
+            <w:r>
+              <w:rPr>
+                <w:rFonts w:ascii="Times New Roman" w:hAnsi="Times New Roman" w:cs="Times New Roman"/>
+                <w:b w:val="0"/>
+                <w:bCs w:val="0"/>
+                <w:sz w:val="24"/>
+                <w:szCs w:val="24"/>
+              </w:rPr>
+              <w:t>Word</w:t>
+            </w:r>
+          </w:p>
+        </w:tc>
+        <w:tc>
+          <w:tcPr>
+            <w:tcW w:w="2394" w:type="dxa"/>
+          </w:tcPr>
+          <w:p>
+            <w:pPr>
+              <w:jc w:val="center"/>
+              <w:cnfStyle w:val="100000000000" w:firstRow="1" w:lastRow="0" w:firstColumn="0" w:lastColumn="0" w:oddVBand="0" w:evenVBand="0" w:oddHBand="0" w:evenHBand="0" w:firstRowFirstColumn="0" w:firstRowLastColumn="0" w:lastRowFirstColumn="0" w:lastRowLastColumn="0"/>
+              <w:rPr>
+                <w:rFonts w:ascii="Times New Roman" w:hAnsi="Times New Roman" w:cs="Times New Roman"/>
+                <w:b w:val="0"/>
+                <w:bCs w:val="0"/>
+                <w:sz w:val="24"/>
+                <w:szCs w:val="24"/>
+              </w:rPr>
+            </w:pPr>
+            <w:r>
+              <w:rPr>
+                <w:rFonts w:ascii="Times New Roman" w:hAnsi="Times New Roman" w:cs="Times New Roman"/>
+                <w:b w:val="0"/>
+                <w:bCs w:val="0"/>
+                <w:sz w:val="24"/>
+                <w:szCs w:val="24"/>
+              </w:rPr>
+              <w:t>Sentiment Score</w:t>
+            </w:r>
+          </w:p>
+        </w:tc>
+      </w:tr>
+      <w:tr>
+        <w:trPr>
+          <w:cnfStyle w:val="000000100000" w:firstRow="0" w:lastRow="0" w:firstColumn="0" w:lastColumn="0" w:oddVBand="0" w:evenVBand="0" w:oddHBand="1" w:evenHBand="0" w:firstRowFirstColumn="0" w:firstRowLastColumn="0" w:lastRowFirstColumn="0" w:lastRowLastColumn="0"/>
+        </w:trPr>
+        <w:tc>
+          <w:tcPr>
+            <w:cnfStyle w:val="001000000000" w:firstRow="0" w:lastRow="0" w:firstColumn="1" w:lastColumn="0" w:oddVBand="0" w:evenVBand="0" w:oddHBand="0" w:evenHBand="0" w:firstRowFirstColumn="0" w:firstRowLastColumn="0" w:lastRowFirstColumn="0" w:lastRowLastColumn="0"/>
+            <w:tcW w:w="2394" w:type="dxa"/>
+          </w:tcPr>
+          <w:p>
+            <w:pPr>
+              <w:jc w:val="both"/>
+              <w:rPr>
+                <w:rFonts w:ascii="Times New Roman" w:hAnsi="Times New Roman" w:cs="Times New Roman"/>
+                <w:b w:val="0"/>
+                <w:bCs w:val="0"/>
+                <w:sz w:val="24"/>
+                <w:szCs w:val="24"/>
+              </w:rPr>
+            </w:pPr>
+            <w:r>
+              <w:rPr>
+                <w:rFonts w:ascii="Times New Roman" w:hAnsi="Times New Roman" w:cs="Times New Roman"/>
+                <w:b w:val="0"/>
+                <w:bCs w:val="0"/>
+                <w:sz w:val="24"/>
+                <w:szCs w:val="24"/>
+              </w:rPr>
+              <w:t>Happy</w:t>
+            </w:r>
+          </w:p>
+        </w:tc>
+        <w:tc>
+          <w:tcPr>
+            <w:tcW w:w="2394" w:type="dxa"/>
+          </w:tcPr>
+          <w:p>
+            <w:pPr>
+              <w:jc w:val="center"/>
+              <w:cnfStyle w:val="000000100000" w:firstRow="0" w:lastRow="0" w:firstColumn="0" w:lastColumn="0" w:oddVBand="0" w:evenVBand="0" w:oddHBand="1" w:evenHBand="0" w:firstRowFirstColumn="0" w:firstRowLastColumn="0" w:lastRowFirstColumn="0" w:lastRowLastColumn="0"/>
+              <w:rPr>
+                <w:rFonts w:ascii="Times New Roman" w:hAnsi="Times New Roman" w:cs="Times New Roman"/>
+                <w:sz w:val="24"/>
+                <w:szCs w:val="24"/>
+              </w:rPr>
+            </w:pPr>
+            <w:r>
+              <w:rPr>
+                <w:rFonts w:ascii="Times New Roman" w:hAnsi="Times New Roman" w:cs="Times New Roman"/>
+                <w:sz w:val="24"/>
+                <w:szCs w:val="24"/>
+              </w:rPr>
+              <w:t>3</w:t>
+            </w:r>
+          </w:p>
+        </w:tc>
+        <w:tc>
+          <w:tcPr>
+            <w:tcW w:w="2394" w:type="dxa"/>
+          </w:tcPr>
+          <w:p>
+            <w:pPr>
+              <w:jc w:val="both"/>
+              <w:cnfStyle w:val="000000100000" w:firstRow="0" w:lastRow="0" w:firstColumn="0" w:lastColumn="0" w:oddVBand="0" w:evenVBand="0" w:oddHBand="1" w:evenHBand="0" w:firstRowFirstColumn="0" w:firstRowLastColumn="0" w:lastRowFirstColumn="0" w:lastRowLastColumn="0"/>
+              <w:rPr>
+                <w:rFonts w:ascii="Times New Roman" w:hAnsi="Times New Roman" w:cs="Times New Roman"/>
+                <w:sz w:val="24"/>
+                <w:szCs w:val="24"/>
+              </w:rPr>
+            </w:pPr>
+            <w:r>
+              <w:rPr>
+                <w:rFonts w:ascii="Times New Roman" w:hAnsi="Times New Roman" w:cs="Times New Roman"/>
+                <w:sz w:val="24"/>
+                <w:szCs w:val="24"/>
+              </w:rPr>
+              <w:t>Problem</w:t>
+            </w:r>
+          </w:p>
+        </w:tc>
+        <w:tc>
+          <w:tcPr>
+            <w:tcW w:w="2394" w:type="dxa"/>
+          </w:tcPr>
+          <w:p>
+            <w:pPr>
+              <w:jc w:val="center"/>
+              <w:cnfStyle w:val="000000100000" w:firstRow="0" w:lastRow="0" w:firstColumn="0" w:lastColumn="0" w:oddVBand="0" w:evenVBand="0" w:oddHBand="1" w:evenHBand="0" w:firstRowFirstColumn="0" w:firstRowLastColumn="0" w:lastRowFirstColumn="0" w:lastRowLastColumn="0"/>
+              <w:rPr>
+                <w:rFonts w:ascii="Times New Roman" w:hAnsi="Times New Roman" w:cs="Times New Roman"/>
+                <w:sz w:val="24"/>
+                <w:szCs w:val="24"/>
+              </w:rPr>
+            </w:pPr>
+            <w:r>
+              <w:rPr>
+                <w:rFonts w:ascii="Times New Roman" w:hAnsi="Times New Roman" w:cs="Times New Roman"/>
+                <w:sz w:val="24"/>
+                <w:szCs w:val="24"/>
+              </w:rPr>
+              <w:t>-2</w:t>
+            </w:r>
+          </w:p>
+        </w:tc>
+      </w:tr>
+      <w:tr>
+        <w:tc>
+          <w:tcPr>
+            <w:cnfStyle w:val="001000000000" w:firstRow="0" w:lastRow="0" w:firstColumn="1" w:lastColumn="0" w:oddVBand="0" w:evenVBand="0" w:oddHBand="0" w:evenHBand="0" w:firstRowFirstColumn="0" w:firstRowLastColumn="0" w:lastRowFirstColumn="0" w:lastRowLastColumn="0"/>
+            <w:tcW w:w="2394" w:type="dxa"/>
+          </w:tcPr>
+          <w:p>
+            <w:pPr>
+              <w:jc w:val="both"/>
+              <w:rPr>
+                <w:rFonts w:ascii="Times New Roman" w:hAnsi="Times New Roman" w:cs="Times New Roman"/>
+                <w:b w:val="0"/>
+                <w:bCs w:val="0"/>
+                <w:sz w:val="24"/>
+                <w:szCs w:val="24"/>
+              </w:rPr>
+            </w:pPr>
+            <w:r>
+              <w:rPr>
+                <w:rFonts w:ascii="Times New Roman" w:hAnsi="Times New Roman" w:cs="Times New Roman"/>
+                <w:b w:val="0"/>
+                <w:bCs w:val="0"/>
+                <w:sz w:val="24"/>
+                <w:szCs w:val="24"/>
+              </w:rPr>
+              <w:t xml:space="preserve">Love </w:t>
+            </w:r>
+          </w:p>
+        </w:tc>
+        <w:tc>
+          <w:tcPr>
+            <w:tcW w:w="2394" w:type="dxa"/>
+          </w:tcPr>
+          <w:p>
+            <w:pPr>
+              <w:jc w:val="center"/>
+              <w:cnfStyle w:val="000000000000" w:firstRow="0" w:lastRow="0" w:firstColumn="0" w:lastColumn="0" w:oddVBand="0" w:evenVBand="0" w:oddHBand="0" w:evenHBand="0" w:firstRowFirstColumn="0" w:firstRowLastColumn="0" w:lastRowFirstColumn="0" w:lastRowLastColumn="0"/>
+              <w:rPr>
+                <w:rFonts w:ascii="Times New Roman" w:hAnsi="Times New Roman" w:cs="Times New Roman"/>
+                <w:sz w:val="24"/>
+                <w:szCs w:val="24"/>
+              </w:rPr>
+            </w:pPr>
+            <w:r>
+              <w:rPr>
+                <w:rFonts w:ascii="Times New Roman" w:hAnsi="Times New Roman" w:cs="Times New Roman"/>
+                <w:sz w:val="24"/>
+                <w:szCs w:val="24"/>
+              </w:rPr>
+              <w:t>3</w:t>
+            </w:r>
+          </w:p>
+        </w:tc>
+        <w:tc>
+          <w:tcPr>
+            <w:tcW w:w="2394" w:type="dxa"/>
+          </w:tcPr>
+          <w:p>
+            <w:pPr>
+              <w:jc w:val="both"/>
+              <w:cnfStyle w:val="000000000000" w:firstRow="0" w:lastRow="0" w:firstColumn="0" w:lastColumn="0" w:oddVBand="0" w:evenVBand="0" w:oddHBand="0" w:evenHBand="0" w:firstRowFirstColumn="0" w:firstRowLastColumn="0" w:lastRowFirstColumn="0" w:lastRowLastColumn="0"/>
+              <w:rPr>
+                <w:rFonts w:ascii="Times New Roman" w:hAnsi="Times New Roman" w:cs="Times New Roman"/>
+                <w:sz w:val="24"/>
+                <w:szCs w:val="24"/>
+              </w:rPr>
+            </w:pPr>
+            <w:r>
+              <w:rPr>
+                <w:rFonts w:ascii="Times New Roman" w:hAnsi="Times New Roman" w:cs="Times New Roman"/>
+                <w:sz w:val="24"/>
+                <w:szCs w:val="24"/>
+              </w:rPr>
+              <w:t>Angry</w:t>
+            </w:r>
+          </w:p>
+        </w:tc>
+        <w:tc>
+          <w:tcPr>
+            <w:tcW w:w="2394" w:type="dxa"/>
+          </w:tcPr>
+          <w:p>
+            <w:pPr>
+              <w:jc w:val="center"/>
+              <w:cnfStyle w:val="000000000000" w:firstRow="0" w:lastRow="0" w:firstColumn="0" w:lastColumn="0" w:oddVBand="0" w:evenVBand="0" w:oddHBand="0" w:evenHBand="0" w:firstRowFirstColumn="0" w:firstRowLastColumn="0" w:lastRowFirstColumn="0" w:lastRowLastColumn="0"/>
+              <w:rPr>
+                <w:rFonts w:ascii="Times New Roman" w:hAnsi="Times New Roman" w:cs="Times New Roman"/>
+                <w:sz w:val="24"/>
+                <w:szCs w:val="24"/>
+              </w:rPr>
+            </w:pPr>
+            <w:r>
+              <w:rPr>
+                <w:rFonts w:ascii="Times New Roman" w:hAnsi="Times New Roman" w:cs="Times New Roman"/>
+                <w:sz w:val="24"/>
+                <w:szCs w:val="24"/>
+              </w:rPr>
+              <w:t>-3</w:t>
+            </w:r>
+          </w:p>
+        </w:tc>
+      </w:tr>
+      <w:tr>
+        <w:trPr>
+          <w:cnfStyle w:val="000000100000" w:firstRow="0" w:lastRow="0" w:firstColumn="0" w:lastColumn="0" w:oddVBand="0" w:evenVBand="0" w:oddHBand="1" w:evenHBand="0" w:firstRowFirstColumn="0" w:firstRowLastColumn="0" w:lastRowFirstColumn="0" w:lastRowLastColumn="0"/>
+        </w:trPr>
+        <w:tc>
+          <w:tcPr>
+            <w:cnfStyle w:val="001000000000" w:firstRow="0" w:lastRow="0" w:firstColumn="1" w:lastColumn="0" w:oddVBand="0" w:evenVBand="0" w:oddHBand="0" w:evenHBand="0" w:firstRowFirstColumn="0" w:firstRowLastColumn="0" w:lastRowFirstColumn="0" w:lastRowLastColumn="0"/>
+            <w:tcW w:w="2394" w:type="dxa"/>
+          </w:tcPr>
+          <w:p>
+            <w:pPr>
+              <w:jc w:val="both"/>
+              <w:rPr>
+                <w:rFonts w:ascii="Times New Roman" w:hAnsi="Times New Roman" w:cs="Times New Roman"/>
+                <w:b w:val="0"/>
+                <w:bCs w:val="0"/>
+                <w:sz w:val="24"/>
+                <w:szCs w:val="24"/>
+              </w:rPr>
+            </w:pPr>
+            <w:r>
+              <w:rPr>
+                <w:rFonts w:ascii="Times New Roman" w:hAnsi="Times New Roman" w:cs="Times New Roman"/>
+                <w:b w:val="0"/>
+                <w:bCs w:val="0"/>
+                <w:sz w:val="24"/>
+                <w:szCs w:val="24"/>
+              </w:rPr>
+              <w:t>Amazing</w:t>
+            </w:r>
+          </w:p>
+        </w:tc>
+        <w:tc>
+          <w:tcPr>
+            <w:tcW w:w="2394" w:type="dxa"/>
+          </w:tcPr>
+          <w:p>
+            <w:pPr>
+              <w:jc w:val="center"/>
+              <w:cnfStyle w:val="000000100000" w:firstRow="0" w:lastRow="0" w:firstColumn="0" w:lastColumn="0" w:oddVBand="0" w:evenVBand="0" w:oddHBand="1" w:evenHBand="0" w:firstRowFirstColumn="0" w:firstRowLastColumn="0" w:lastRowFirstColumn="0" w:lastRowLastColumn="0"/>
+              <w:rPr>
+                <w:rFonts w:ascii="Times New Roman" w:hAnsi="Times New Roman" w:cs="Times New Roman"/>
+                <w:sz w:val="24"/>
+                <w:szCs w:val="24"/>
+              </w:rPr>
+            </w:pPr>
+            <w:r>
+              <w:rPr>
+                <w:rFonts w:ascii="Times New Roman" w:hAnsi="Times New Roman" w:cs="Times New Roman"/>
+                <w:sz w:val="24"/>
+                <w:szCs w:val="24"/>
+              </w:rPr>
+              <w:t>4</w:t>
+            </w:r>
+          </w:p>
+        </w:tc>
+        <w:tc>
+          <w:tcPr>
+            <w:tcW w:w="2394" w:type="dxa"/>
+          </w:tcPr>
+          <w:p>
+            <w:pPr>
+              <w:jc w:val="both"/>
+              <w:cnfStyle w:val="000000100000" w:firstRow="0" w:lastRow="0" w:firstColumn="0" w:lastColumn="0" w:oddVBand="0" w:evenVBand="0" w:oddHBand="1" w:evenHBand="0" w:firstRowFirstColumn="0" w:firstRowLastColumn="0" w:lastRowFirstColumn="0" w:lastRowLastColumn="0"/>
+              <w:rPr>
+                <w:rFonts w:ascii="Times New Roman" w:hAnsi="Times New Roman" w:cs="Times New Roman"/>
+                <w:sz w:val="24"/>
+                <w:szCs w:val="24"/>
+              </w:rPr>
+            </w:pPr>
+            <w:r>
+              <w:rPr>
+                <w:rFonts w:ascii="Times New Roman" w:hAnsi="Times New Roman" w:cs="Times New Roman"/>
+                <w:sz w:val="24"/>
+                <w:szCs w:val="24"/>
+              </w:rPr>
+              <w:t>Abuse</w:t>
+            </w:r>
+          </w:p>
+        </w:tc>
+        <w:tc>
+          <w:tcPr>
+            <w:tcW w:w="2394" w:type="dxa"/>
+          </w:tcPr>
+          <w:p>
+            <w:pPr>
+              <w:jc w:val="center"/>
+              <w:cnfStyle w:val="000000100000" w:firstRow="0" w:lastRow="0" w:firstColumn="0" w:lastColumn="0" w:oddVBand="0" w:evenVBand="0" w:oddHBand="1" w:evenHBand="0" w:firstRowFirstColumn="0" w:firstRowLastColumn="0" w:lastRowFirstColumn="0" w:lastRowLastColumn="0"/>
+              <w:rPr>
+                <w:rFonts w:ascii="Times New Roman" w:hAnsi="Times New Roman" w:cs="Times New Roman"/>
+                <w:sz w:val="24"/>
+                <w:szCs w:val="24"/>
+              </w:rPr>
+            </w:pPr>
+            <w:r>
+              <w:rPr>
+                <w:rFonts w:ascii="Times New Roman" w:hAnsi="Times New Roman" w:cs="Times New Roman"/>
+                <w:sz w:val="24"/>
+                <w:szCs w:val="24"/>
+              </w:rPr>
+              <w:t>-3</w:t>
+            </w:r>
+          </w:p>
+        </w:tc>
+      </w:tr>
+      <w:tr>
+        <w:tc>
+          <w:tcPr>
+            <w:cnfStyle w:val="001000000000" w:firstRow="0" w:lastRow="0" w:firstColumn="1" w:lastColumn="0" w:oddVBand="0" w:evenVBand="0" w:oddHBand="0" w:evenHBand="0" w:firstRowFirstColumn="0" w:firstRowLastColumn="0" w:lastRowFirstColumn="0" w:lastRowLastColumn="0"/>
+            <w:tcW w:w="2394" w:type="dxa"/>
+          </w:tcPr>
+          <w:p>
+            <w:pPr>
+              <w:jc w:val="both"/>
+              <w:rPr>
+                <w:rFonts w:ascii="Times New Roman" w:hAnsi="Times New Roman" w:cs="Times New Roman"/>
+                <w:b w:val="0"/>
+                <w:bCs w:val="0"/>
+                <w:sz w:val="24"/>
+                <w:szCs w:val="24"/>
+              </w:rPr>
+            </w:pPr>
+            <w:r>
+              <w:rPr>
+                <w:rFonts w:ascii="Times New Roman" w:hAnsi="Times New Roman" w:cs="Times New Roman"/>
+                <w:b w:val="0"/>
+                <w:bCs w:val="0"/>
+                <w:sz w:val="24"/>
+                <w:szCs w:val="24"/>
+              </w:rPr>
+              <w:t>Excellent</w:t>
+            </w:r>
+          </w:p>
+        </w:tc>
+        <w:tc>
+          <w:tcPr>
+            <w:tcW w:w="2394" w:type="dxa"/>
+          </w:tcPr>
+          <w:p>
+            <w:pPr>
+              <w:jc w:val="center"/>
+              <w:cnfStyle w:val="000000000000" w:firstRow="0" w:lastRow="0" w:firstColumn="0" w:lastColumn="0" w:oddVBand="0" w:evenVBand="0" w:oddHBand="0" w:evenHBand="0" w:firstRowFirstColumn="0" w:firstRowLastColumn="0" w:lastRowFirstColumn="0" w:lastRowLastColumn="0"/>
+              <w:rPr>
+                <w:rFonts w:ascii="Times New Roman" w:hAnsi="Times New Roman" w:cs="Times New Roman"/>
+                <w:sz w:val="24"/>
+                <w:szCs w:val="24"/>
+              </w:rPr>
+            </w:pPr>
+            <w:r>
+              <w:rPr>
+                <w:rFonts w:ascii="Times New Roman" w:hAnsi="Times New Roman" w:cs="Times New Roman"/>
+                <w:sz w:val="24"/>
+                <w:szCs w:val="24"/>
+              </w:rPr>
+              <w:t>3</w:t>
+            </w:r>
+          </w:p>
+        </w:tc>
+        <w:tc>
+          <w:tcPr>
+            <w:tcW w:w="2394" w:type="dxa"/>
+          </w:tcPr>
+          <w:p>
+            <w:pPr>
+              <w:jc w:val="both"/>
+              <w:cnfStyle w:val="000000000000" w:firstRow="0" w:lastRow="0" w:firstColumn="0" w:lastColumn="0" w:oddVBand="0" w:evenVBand="0" w:oddHBand="0" w:evenHBand="0" w:firstRowFirstColumn="0" w:firstRowLastColumn="0" w:lastRowFirstColumn="0" w:lastRowLastColumn="0"/>
+              <w:rPr>
+                <w:rFonts w:ascii="Times New Roman" w:hAnsi="Times New Roman" w:cs="Times New Roman"/>
+                <w:sz w:val="24"/>
+                <w:szCs w:val="24"/>
+              </w:rPr>
+            </w:pPr>
+            <w:r>
+              <w:rPr>
+                <w:rFonts w:ascii="Times New Roman" w:hAnsi="Times New Roman" w:cs="Times New Roman"/>
+                <w:sz w:val="24"/>
+                <w:szCs w:val="24"/>
+              </w:rPr>
+              <w:t>Disaster</w:t>
+            </w:r>
+          </w:p>
+        </w:tc>
+        <w:tc>
+          <w:tcPr>
+            <w:tcW w:w="2394" w:type="dxa"/>
+          </w:tcPr>
+          <w:p>
+            <w:pPr>
+              <w:jc w:val="center"/>
+              <w:cnfStyle w:val="000000000000" w:firstRow="0" w:lastRow="0" w:firstColumn="0" w:lastColumn="0" w:oddVBand="0" w:evenVBand="0" w:oddHBand="0" w:evenHBand="0" w:firstRowFirstColumn="0" w:firstRowLastColumn="0" w:lastRowFirstColumn="0" w:lastRowLastColumn="0"/>
+              <w:rPr>
+                <w:rFonts w:ascii="Times New Roman" w:hAnsi="Times New Roman" w:cs="Times New Roman"/>
+                <w:sz w:val="24"/>
+                <w:szCs w:val="24"/>
+              </w:rPr>
+            </w:pPr>
+            <w:r>
+              <w:rPr>
+                <w:rFonts w:ascii="Times New Roman" w:hAnsi="Times New Roman" w:cs="Times New Roman"/>
+                <w:sz w:val="24"/>
+                <w:szCs w:val="24"/>
+              </w:rPr>
+              <w:t>-2</w:t>
+            </w:r>
+          </w:p>
+        </w:tc>
+      </w:tr>
+      <w:tr>
+        <w:trPr>
+          <w:cnfStyle w:val="000000100000" w:firstRow="0" w:lastRow="0" w:firstColumn="0" w:lastColumn="0" w:oddVBand="0" w:evenVBand="0" w:oddHBand="1" w:evenHBand="0" w:firstRowFirstColumn="0" w:firstRowLastColumn="0" w:lastRowFirstColumn="0" w:lastRowLastColumn="0"/>
+        </w:trPr>
+        <w:tc>
+          <w:tcPr>
+            <w:cnfStyle w:val="001000000000" w:firstRow="0" w:lastRow="0" w:firstColumn="1" w:lastColumn="0" w:oddVBand="0" w:evenVBand="0" w:oddHBand="0" w:evenHBand="0" w:firstRowFirstColumn="0" w:firstRowLastColumn="0" w:lastRowFirstColumn="0" w:lastRowLastColumn="0"/>
+            <w:tcW w:w="2394" w:type="dxa"/>
+          </w:tcPr>
+          <w:p>
+            <w:pPr>
+              <w:jc w:val="both"/>
+              <w:rPr>
+                <w:rFonts w:ascii="Times New Roman" w:hAnsi="Times New Roman" w:cs="Times New Roman"/>
+                <w:b w:val="0"/>
+                <w:bCs w:val="0"/>
+                <w:sz w:val="24"/>
+                <w:szCs w:val="24"/>
+              </w:rPr>
+            </w:pPr>
+            <w:r>
+              <w:rPr>
+                <w:rFonts w:ascii="Times New Roman" w:hAnsi="Times New Roman" w:cs="Times New Roman"/>
+                <w:b w:val="0"/>
+                <w:bCs w:val="0"/>
+                <w:sz w:val="24"/>
+                <w:szCs w:val="24"/>
+              </w:rPr>
+              <w:t>Neutral</w:t>
+            </w:r>
+          </w:p>
+        </w:tc>
+        <w:tc>
+          <w:tcPr>
+            <w:tcW w:w="2394" w:type="dxa"/>
+          </w:tcPr>
+          <w:p>
+            <w:pPr>
+              <w:jc w:val="center"/>
+              <w:cnfStyle w:val="000000100000" w:firstRow="0" w:lastRow="0" w:firstColumn="0" w:lastColumn="0" w:oddVBand="0" w:evenVBand="0" w:oddHBand="1" w:evenHBand="0" w:firstRowFirstColumn="0" w:firstRowLastColumn="0" w:lastRowFirstColumn="0" w:lastRowLastColumn="0"/>
+              <w:rPr>
+                <w:rFonts w:ascii="Times New Roman" w:hAnsi="Times New Roman" w:cs="Times New Roman"/>
+                <w:sz w:val="24"/>
+                <w:szCs w:val="24"/>
+              </w:rPr>
+            </w:pPr>
+            <w:r>
+              <w:rPr>
+                <w:rFonts w:ascii="Times New Roman" w:hAnsi="Times New Roman" w:cs="Times New Roman"/>
+                <w:sz w:val="24"/>
+                <w:szCs w:val="24"/>
+              </w:rPr>
+              <w:t>0</w:t>
+            </w:r>
+          </w:p>
+        </w:tc>
+        <w:tc>
+          <w:tcPr>
+            <w:tcW w:w="2394" w:type="dxa"/>
+          </w:tcPr>
+          <w:p>
+            <w:pPr>
+              <w:jc w:val="both"/>
+              <w:cnfStyle w:val="000000100000" w:firstRow="0" w:lastRow="0" w:firstColumn="0" w:lastColumn="0" w:oddVBand="0" w:evenVBand="0" w:oddHBand="1" w:evenHBand="0" w:firstRowFirstColumn="0" w:firstRowLastColumn="0" w:lastRowFirstColumn="0" w:lastRowLastColumn="0"/>
+              <w:rPr>
+                <w:rFonts w:ascii="Times New Roman" w:hAnsi="Times New Roman" w:cs="Times New Roman"/>
+                <w:sz w:val="24"/>
+                <w:szCs w:val="24"/>
+              </w:rPr>
+            </w:pPr>
+            <w:r>
+              <w:rPr>
+                <w:rFonts w:ascii="Times New Roman" w:hAnsi="Times New Roman" w:cs="Times New Roman"/>
+                <w:sz w:val="24"/>
+                <w:szCs w:val="24"/>
+              </w:rPr>
+              <w:t>Hate</w:t>
+            </w:r>
+          </w:p>
+        </w:tc>
+        <w:tc>
+          <w:tcPr>
+            <w:tcW w:w="2394" w:type="dxa"/>
+          </w:tcPr>
+          <w:p>
+            <w:pPr>
+              <w:jc w:val="center"/>
+              <w:cnfStyle w:val="000000100000" w:firstRow="0" w:lastRow="0" w:firstColumn="0" w:lastColumn="0" w:oddVBand="0" w:evenVBand="0" w:oddHBand="1" w:evenHBand="0" w:firstRowFirstColumn="0" w:firstRowLastColumn="0" w:lastRowFirstColumn="0" w:lastRowLastColumn="0"/>
+              <w:rPr>
+                <w:rFonts w:ascii="Times New Roman" w:hAnsi="Times New Roman" w:cs="Times New Roman"/>
+                <w:sz w:val="24"/>
+                <w:szCs w:val="24"/>
+              </w:rPr>
+            </w:pPr>
+            <w:r>
+              <w:rPr>
+                <w:rFonts w:ascii="Times New Roman" w:hAnsi="Times New Roman" w:cs="Times New Roman"/>
+                <w:sz w:val="24"/>
+                <w:szCs w:val="24"/>
+              </w:rPr>
+              <w:t>-3</w:t>
+            </w:r>
+          </w:p>
+        </w:tc>
+      </w:tr>
+    </w:tbl>
+    <w:p>
+      <w:pPr>
+        <w:jc w:val="both"/>
+        <w:rPr>
+          <w:rFonts w:ascii="Times New Roman" w:hAnsi="Times New Roman" w:cs="Times New Roman"/>
+          <w:sz w:val="24"/>
+          <w:szCs w:val="24"/>
+        </w:rPr>
+      </w:pPr>
+      <w:r>
+        <w:rPr>
+          <w:rFonts w:ascii="Times New Roman" w:hAnsi="Times New Roman" w:cs="Times New Roman"/>
+          <w:sz w:val="24"/>
+          <w:szCs w:val="24"/>
+        </w:rPr>
+        <w:lastRenderedPageBreak/>
+        <w:t xml:space="preserve">AFFIN offers a transparent and computationally efficient approach that is well suited for large-scale collections of news articles and time-series analysis. However, as a word-lexicon, it does not account for context, negation, or domain-specific language, which may introduce measurement error in news text. </w:t>
+      </w:r>
+    </w:p>
+    <w:p>
+      <w:pPr>
         <w:pStyle w:val="Heading1"/>
+        <w:numPr>
+          <w:ilvl w:val="0"/>
+          <w:numId w:val="15"/>
+        </w:numPr>
       </w:pPr>
       <w:r>
         <w:t xml:space="preserve">Result </w:t>
@@ -1792,19 +2511,7 @@
           <w:sz w:val="24"/>
           <w:szCs w:val="24"/>
         </w:rPr>
-        <w:t xml:space="preserve"> such as (‘white’, ‘house’), (‘tax’, ‘cuts’), </w:t>
-      </w:r>
-      <w:r>
-        <w:rPr>
-          <w:b w:val="0"/>
-          <w:bCs/>
-          <w:i w:val="0"/>
-          <w:iCs w:val="0"/>
-          <w:sz w:val="24"/>
-          <w:szCs w:val="24"/>
-        </w:rPr>
-        <w:lastRenderedPageBreak/>
-        <w:t>(‘executive’, ‘order’) and (‘</w:t>
+        <w:t xml:space="preserve"> such as (‘white’, ‘house’), (‘tax’, ‘cuts’), (‘executive’, ‘order’) and (‘</w:t>
       </w:r>
       <w:proofErr w:type="spellStart"/>
       <w:r>
@@ -2142,22 +2849,14 @@
           <w:sz w:val="24"/>
           <w:szCs w:val="24"/>
         </w:rPr>
-        <w:instrText xml:space="preserve"> REF _Ref218242650 \h </w:instrText>
-      </w:r>
-      <w:r>
-        <w:rPr>
-          <w:rFonts w:ascii="Times New Roman" w:hAnsi="Times New Roman" w:cs="Times New Roman"/>
-          <w:sz w:val="24"/>
-          <w:szCs w:val="24"/>
-        </w:rPr>
-      </w:r>
-      <w:r>
-        <w:rPr>
-          <w:rFonts w:ascii="Times New Roman" w:hAnsi="Times New Roman" w:cs="Times New Roman"/>
-          <w:sz w:val="24"/>
-          <w:szCs w:val="24"/>
-        </w:rPr>
-        <w:instrText xml:space="preserve"> \* MERGEFORMAT </w:instrText>
+        <w:instrText xml:space="preserve"> REF _Ref218242650 \h  \* MERGEFORMAT </w:instrText>
+      </w:r>
+      <w:r>
+        <w:rPr>
+          <w:rFonts w:ascii="Times New Roman" w:hAnsi="Times New Roman" w:cs="Times New Roman"/>
+          <w:sz w:val="24"/>
+          <w:szCs w:val="24"/>
+        </w:rPr>
       </w:r>
       <w:r>
         <w:rPr>
@@ -2720,6 +3419,7 @@
       <w:bookmarkStart w:id="3" w:name="_Ref218242650"/>
       <w:bookmarkEnd w:id="2"/>
       <w:r>
+        <w:lastRenderedPageBreak/>
         <w:t xml:space="preserve">Figure </w:t>
       </w:r>
       <w:fldSimple w:instr=" SEQ Figure \* ARABIC ">
@@ -2740,9 +3440,8 @@
         <w:rPr>
           <w:noProof/>
         </w:rPr>
-        <w:lastRenderedPageBreak/>
         <w:drawing>
-          <wp:inline distT="0" distB="0" distL="0" distR="0" wp14:anchorId="519E39A5" wp14:editId="7035BA06">
+          <wp:inline distT="0" distB="0" distL="0" distR="0" wp14:anchorId="519E39A5" wp14:editId="4036D876">
             <wp:extent cx="5939790" cy="2973705"/>
             <wp:effectExtent l="0" t="0" r="3810" b="0"/>
             <wp:docPr id="91830276" name="Picture 3"/>
@@ -2831,22 +3530,14 @@
           <w:sz w:val="24"/>
           <w:szCs w:val="24"/>
         </w:rPr>
-        <w:instrText xml:space="preserve"> REF _Ref218247329 \h </w:instrText>
-      </w:r>
-      <w:r>
-        <w:rPr>
-          <w:rFonts w:ascii="Times New Roman" w:hAnsi="Times New Roman" w:cs="Times New Roman"/>
-          <w:sz w:val="24"/>
-          <w:szCs w:val="24"/>
-        </w:rPr>
-      </w:r>
-      <w:r>
-        <w:rPr>
-          <w:rFonts w:ascii="Times New Roman" w:hAnsi="Times New Roman" w:cs="Times New Roman"/>
-          <w:sz w:val="24"/>
-          <w:szCs w:val="24"/>
-        </w:rPr>
-        <w:instrText xml:space="preserve"> \* MERGEFORMAT </w:instrText>
+        <w:instrText xml:space="preserve"> REF _Ref218247329 \h  \* MERGEFORMAT </w:instrText>
+      </w:r>
+      <w:r>
+        <w:rPr>
+          <w:rFonts w:ascii="Times New Roman" w:hAnsi="Times New Roman" w:cs="Times New Roman"/>
+          <w:sz w:val="24"/>
+          <w:szCs w:val="24"/>
+        </w:rPr>
       </w:r>
       <w:r>
         <w:rPr>
@@ -2871,7 +3562,7 @@
           <w:sz w:val="24"/>
           <w:szCs w:val="24"/>
         </w:rPr>
-        <w:t>1</w:t>
+        <w:t>2</w:t>
       </w:r>
       <w:r>
         <w:rPr>
@@ -2952,7 +3643,7 @@
           <w:rPr>
             <w:noProof/>
           </w:rPr>
-          <w:t>1</w:t>
+          <w:t>2</w:t>
         </w:r>
       </w:fldSimple>
       <w:bookmarkEnd w:id="5"/>
@@ -3468,14 +4159,17 @@
       </w:r>
     </w:p>
     <w:p>
+      <w:pPr>
+        <w:jc w:val="center"/>
+      </w:pPr>
       <w:r>
         <w:rPr>
           <w:noProof/>
         </w:rPr>
         <w:drawing>
-          <wp:inline distT="0" distB="0" distL="0" distR="0" wp14:anchorId="27E9986B" wp14:editId="2FEAE23E">
-            <wp:extent cx="5939790" cy="2122805"/>
-            <wp:effectExtent l="0" t="0" r="3810" b="0"/>
+          <wp:inline distT="0" distB="0" distL="0" distR="0" wp14:anchorId="27E9986B" wp14:editId="6B34DD4F">
+            <wp:extent cx="5177642" cy="1850423"/>
+            <wp:effectExtent l="0" t="0" r="4445" b="0"/>
             <wp:docPr id="2057323138" name="Picture 4"/>
             <wp:cNvGraphicFramePr>
               <a:graphicFrameLocks xmlns:a="http://schemas.openxmlformats.org/drawingml/2006/main" noChangeAspect="1"/>
@@ -3505,7 +4199,7 @@
                   <pic:spPr bwMode="auto">
                     <a:xfrm>
                       <a:off x="0" y="0"/>
-                      <a:ext cx="5939790" cy="2122805"/>
+                      <a:ext cx="5187840" cy="1854068"/>
                     </a:xfrm>
                     <a:prstGeom prst="rect">
                       <a:avLst/>
@@ -3749,7 +4443,39 @@
           <w:szCs w:val="24"/>
         </w:rPr>
         <w:lastRenderedPageBreak/>
-        <w:t>Finally, sentiment differs systematically depending on political references. In both outlets, articles that do not mention Donald Trump exhibit significantly higher positive sentiment, suggesting that non-political or “straight” economic reporting—such as market updates or employment statistics—tends to use more optimistic language. When Trump is mentioned, Fox News still maintains a higher average sentiment score than CNN (approximately 0.011 versus 0.008), consistent with prior findings that Fox News employs more supportive framing, while CNN’s coverage is generally more critical.</w:t>
+        <w:t>Finally, sentiment differs systematically depending on political references. In both outlets, articles that do not mention Donald Trump exhibit significantly higher positive sentiment, suggesting that non-political or “straight” economic reporting</w:t>
+      </w:r>
+      <w:r>
+        <w:rPr>
+          <w:rFonts w:ascii="Times New Roman" w:hAnsi="Times New Roman" w:cs="Times New Roman"/>
+          <w:sz w:val="24"/>
+          <w:szCs w:val="24"/>
+        </w:rPr>
+        <w:t xml:space="preserve">, </w:t>
+      </w:r>
+      <w:r>
+        <w:rPr>
+          <w:rFonts w:ascii="Times New Roman" w:hAnsi="Times New Roman" w:cs="Times New Roman"/>
+          <w:sz w:val="24"/>
+          <w:szCs w:val="24"/>
+        </w:rPr>
+        <w:t>such as market updates or employment statistics</w:t>
+      </w:r>
+      <w:r>
+        <w:rPr>
+          <w:rFonts w:ascii="Times New Roman" w:hAnsi="Times New Roman" w:cs="Times New Roman"/>
+          <w:sz w:val="24"/>
+          <w:szCs w:val="24"/>
+        </w:rPr>
+        <w:t xml:space="preserve">, </w:t>
+      </w:r>
+      <w:r>
+        <w:rPr>
+          <w:rFonts w:ascii="Times New Roman" w:hAnsi="Times New Roman" w:cs="Times New Roman"/>
+          <w:sz w:val="24"/>
+          <w:szCs w:val="24"/>
+        </w:rPr>
+        <w:t>tends to use more optimistic language. When Trump is mentioned, Fox News still maintains a higher average sentiment score than CNN, consistent with prior findings that Fox News employs more supportive framing, while CNN’s coverage is generally more critical.</w:t>
       </w:r>
     </w:p>
     <w:bookmarkEnd w:id="8"/>
@@ -3781,9 +4507,9 @@
           <w:noProof/>
         </w:rPr>
         <w:drawing>
-          <wp:inline distT="0" distB="0" distL="0" distR="0" wp14:anchorId="3EF38879" wp14:editId="41B3DFFB">
-            <wp:extent cx="5936615" cy="3712210"/>
-            <wp:effectExtent l="0" t="0" r="6985" b="2540"/>
+          <wp:inline distT="0" distB="0" distL="0" distR="0" wp14:anchorId="3EF38879" wp14:editId="49195092">
+            <wp:extent cx="5284519" cy="3304449"/>
+            <wp:effectExtent l="0" t="0" r="0" b="0"/>
             <wp:docPr id="1241056338" name="Picture 7"/>
             <wp:cNvGraphicFramePr>
               <a:graphicFrameLocks xmlns:a="http://schemas.openxmlformats.org/drawingml/2006/main" noChangeAspect="1"/>
@@ -3813,7 +4539,7 @@
                   <pic:spPr bwMode="auto">
                     <a:xfrm>
                       <a:off x="0" y="0"/>
-                      <a:ext cx="5936615" cy="3712210"/>
+                      <a:ext cx="5289733" cy="3307710"/>
                     </a:xfrm>
                     <a:prstGeom prst="rect">
                       <a:avLst/>
@@ -3833,6 +4559,10 @@
     <w:p>
       <w:pPr>
         <w:pStyle w:val="Heading1"/>
+        <w:numPr>
+          <w:ilvl w:val="0"/>
+          <w:numId w:val="15"/>
+        </w:numPr>
       </w:pPr>
       <w:r>
         <w:t>Discussion</w:t>
@@ -3840,6 +4570,7 @@
     </w:p>
     <w:p>
       <w:pPr>
+        <w:jc w:val="both"/>
         <w:rPr>
           <w:rFonts w:ascii="Times New Roman" w:hAnsi="Times New Roman" w:cs="Times New Roman"/>
           <w:b/>
@@ -3856,25 +4587,65 @@
           <w:sz w:val="24"/>
           <w:szCs w:val="24"/>
         </w:rPr>
-        <w:t>Key Findings</w:t>
+        <w:t>Key findings</w:t>
       </w:r>
     </w:p>
     <w:p>
       <w:pPr>
-        <w:numPr>
-          <w:ilvl w:val="0"/>
-          <w:numId w:val="12"/>
-        </w:numPr>
-        <w:tabs>
-          <w:tab w:val="num" w:pos="720"/>
-        </w:tabs>
-        <w:rPr>
-          <w:rFonts w:ascii="Times New Roman" w:hAnsi="Times New Roman" w:cs="Times New Roman"/>
-          <w:sz w:val="24"/>
-          <w:szCs w:val="24"/>
-        </w:rPr>
-      </w:pPr>
-      <w:r>
+        <w:jc w:val="both"/>
+        <w:rPr>
+          <w:rFonts w:ascii="Times New Roman" w:hAnsi="Times New Roman" w:cs="Times New Roman"/>
+          <w:sz w:val="24"/>
+          <w:szCs w:val="24"/>
+        </w:rPr>
+      </w:pPr>
+      <w:r>
+        <w:rPr>
+          <w:rFonts w:ascii="Times New Roman" w:hAnsi="Times New Roman" w:cs="Times New Roman"/>
+          <w:sz w:val="24"/>
+          <w:szCs w:val="24"/>
+        </w:rPr>
+        <w:t xml:space="preserve">This study documents systematic differences in how liberal- and conservative-leaning news outlets frame economic conditions, both in terms of thematic emphasis and sentiment. The bigram analysis reveals that CNN and Fox News prioritize distinct dimensions of economic reporting. CNN’ coverage is more heavily oriented toward macroeconomic indicators and institutions such as the labor market, interest rates, and the Federal Reserve, suggesting a technocratic and indicator-driven framing of economic conditions. In </w:t>
+      </w:r>
+      <w:r>
+        <w:rPr>
+          <w:rFonts w:ascii="Times New Roman" w:hAnsi="Times New Roman" w:cs="Times New Roman"/>
+          <w:sz w:val="24"/>
+          <w:szCs w:val="24"/>
+        </w:rPr>
+        <w:t xml:space="preserve">contrast, Fox News places greater emphasis on political actors and executive decision-making, with frequent references to the White House, administrative actions, and fiscal responsibility, reflecting a more personalized and policy-centered narrative of the economy. </w:t>
+      </w:r>
+    </w:p>
+    <w:p>
+      <w:pPr>
+        <w:jc w:val="both"/>
+        <w:rPr>
+          <w:rFonts w:ascii="Times New Roman" w:hAnsi="Times New Roman" w:cs="Times New Roman"/>
+          <w:sz w:val="24"/>
+          <w:szCs w:val="24"/>
+        </w:rPr>
+      </w:pPr>
+      <w:r>
+        <w:rPr>
+          <w:rFonts w:ascii="Times New Roman" w:hAnsi="Times New Roman" w:cs="Times New Roman"/>
+          <w:sz w:val="24"/>
+          <w:szCs w:val="24"/>
+        </w:rPr>
+        <w:lastRenderedPageBreak/>
+        <w:t xml:space="preserve">Despite these clear content differences, sentiment analysis shows that overall tone is broadly </w:t>
+      </w:r>
+      <w:r>
+        <w:rPr>
+          <w:rFonts w:ascii="Times New Roman" w:hAnsi="Times New Roman" w:cs="Times New Roman"/>
+          <w:sz w:val="24"/>
+          <w:szCs w:val="24"/>
+        </w:rPr>
+        <w:t xml:space="preserve">similar across outlets. Both CNN and Fox News exhibit sentiment scores close to neutral, with a slight positive bias, and only modest differences in means and dispersion. However, sentiment differences become more pronounced when the analysis is disaggregated by economic category and political references. Fox News consistently displays higher sentiment scores across most categories, particularly for GDP growth and commodities. Moreover, sentiment drops for both outlets when articles reference Donald Trump, although Fox News maintains relatively more positive tone, consistent with ideological alignment. </w:t>
+      </w:r>
+    </w:p>
+    <w:p>
+      <w:pPr>
+        <w:jc w:val="both"/>
         <w:rPr>
           <w:rFonts w:ascii="Times New Roman" w:hAnsi="Times New Roman" w:cs="Times New Roman"/>
           <w:b/>
@@ -3882,34 +4653,39 @@
           <w:sz w:val="24"/>
           <w:szCs w:val="24"/>
         </w:rPr>
-        <w:t>Framing differences:</w:t>
-      </w:r>
-      <w:r>
-        <w:rPr>
-          <w:rFonts w:ascii="Times New Roman" w:hAnsi="Times New Roman" w:cs="Times New Roman"/>
-          <w:sz w:val="24"/>
-          <w:szCs w:val="24"/>
-        </w:rPr>
-        <w:br/>
-        <w:t>CNN focuses on economic indicators, institutional actors, and technical terminology (e.g., labor market, interest rates, Federal Reserve), reflecting a data- and institution-oriented approach. Fox News emphasizes executive actions, policy decisions, and political actors (e.g., White House, tax cuts), suggesting a narrative- and politics-driven framing. This indicates that both outlets report on similar economic events but highlight different aspects to shape the story.</w:t>
+      </w:pPr>
+      <w:r>
+        <w:rPr>
+          <w:rFonts w:ascii="Times New Roman" w:hAnsi="Times New Roman" w:cs="Times New Roman"/>
+          <w:b/>
+          <w:bCs/>
+          <w:sz w:val="24"/>
+          <w:szCs w:val="24"/>
+        </w:rPr>
+        <w:t>Limitations</w:t>
       </w:r>
     </w:p>
     <w:p>
       <w:pPr>
-        <w:numPr>
-          <w:ilvl w:val="0"/>
-          <w:numId w:val="12"/>
-        </w:numPr>
-        <w:tabs>
-          <w:tab w:val="num" w:pos="720"/>
-        </w:tabs>
-        <w:rPr>
-          <w:rFonts w:ascii="Times New Roman" w:hAnsi="Times New Roman" w:cs="Times New Roman"/>
-          <w:sz w:val="24"/>
-          <w:szCs w:val="24"/>
-        </w:rPr>
-      </w:pPr>
-      <w:r>
+        <w:jc w:val="both"/>
+        <w:rPr>
+          <w:rFonts w:ascii="Times New Roman" w:hAnsi="Times New Roman" w:cs="Times New Roman"/>
+          <w:sz w:val="24"/>
+          <w:szCs w:val="24"/>
+        </w:rPr>
+      </w:pPr>
+      <w:r>
+        <w:rPr>
+          <w:rFonts w:ascii="Times New Roman" w:hAnsi="Times New Roman" w:cs="Times New Roman"/>
+          <w:sz w:val="24"/>
+          <w:szCs w:val="24"/>
+        </w:rPr>
+        <w:t>This study has several limitations. First, sentiment is measured using the AFINN lexicon, which operates at the word level and does not account for context, negation, or irony. As a result, sentiment scores may misclassify tone in complex or neutral journalistic language. Second, the analysis is limited to two outlets and a single year, which constrains generalizability and reduces statistical power in time-series comparisons. Finally, bigram analysis captures surface-level phrase usage but cannot fully recover deeper narrative structures or causal framing strategies.</w:t>
+      </w:r>
+    </w:p>
+    <w:p>
+      <w:pPr>
+        <w:jc w:val="both"/>
         <w:rPr>
           <w:rFonts w:ascii="Times New Roman" w:hAnsi="Times New Roman" w:cs="Times New Roman"/>
           <w:b/>
@@ -3917,123 +4693,69 @@
           <w:sz w:val="24"/>
           <w:szCs w:val="24"/>
         </w:rPr>
-        <w:lastRenderedPageBreak/>
-        <w:t>Overall sentiment:</w:t>
-      </w:r>
-      <w:r>
-        <w:rPr>
-          <w:rFonts w:ascii="Times New Roman" w:hAnsi="Times New Roman" w:cs="Times New Roman"/>
-          <w:sz w:val="24"/>
-          <w:szCs w:val="24"/>
-        </w:rPr>
-        <w:br/>
-        <w:t>Both outlets show largely neutral economic coverage with a slight positive bias. Fox News has marginally higher average sentiment and slightly greater dispersion, suggesting a more polarized tone. However, the differences are modest, and median values indicate no strong skewness or influence from extreme outliers.</w:t>
+      </w:pPr>
+      <w:r>
+        <w:rPr>
+          <w:rFonts w:ascii="Times New Roman" w:hAnsi="Times New Roman" w:cs="Times New Roman"/>
+          <w:b/>
+          <w:bCs/>
+          <w:sz w:val="24"/>
+          <w:szCs w:val="24"/>
+        </w:rPr>
+        <w:t>Directions for future research</w:t>
       </w:r>
     </w:p>
     <w:p>
       <w:pPr>
-        <w:numPr>
-          <w:ilvl w:val="0"/>
-          <w:numId w:val="12"/>
-        </w:numPr>
-        <w:tabs>
-          <w:tab w:val="num" w:pos="720"/>
-        </w:tabs>
-        <w:rPr>
-          <w:rFonts w:ascii="Times New Roman" w:hAnsi="Times New Roman" w:cs="Times New Roman"/>
-          <w:sz w:val="24"/>
-          <w:szCs w:val="24"/>
-        </w:rPr>
-      </w:pPr>
-      <w:r>
-        <w:rPr>
-          <w:rFonts w:ascii="Times New Roman" w:hAnsi="Times New Roman" w:cs="Times New Roman"/>
-          <w:b/>
-          <w:bCs/>
-          <w:sz w:val="24"/>
-          <w:szCs w:val="24"/>
-        </w:rPr>
-        <w:t>Category-level variation:</w:t>
-      </w:r>
-      <w:r>
-        <w:rPr>
-          <w:rFonts w:ascii="Times New Roman" w:hAnsi="Times New Roman" w:cs="Times New Roman"/>
-          <w:sz w:val="24"/>
-          <w:szCs w:val="24"/>
-        </w:rPr>
-        <w:br/>
-        <w:t>Differences in sentiment are more pronounced when examining specific economic categories. Fox News shows higher sentiment in most categories, especially GDP growth and labor markets, while differences are smaller for monetary policy coverage. This suggests that while both outlets cover the same macroeconomic indicators, linguistic framing varies by topic.</w:t>
+        <w:jc w:val="both"/>
+        <w:rPr>
+          <w:rFonts w:ascii="Times New Roman" w:hAnsi="Times New Roman" w:cs="Times New Roman"/>
+          <w:sz w:val="24"/>
+          <w:szCs w:val="24"/>
+        </w:rPr>
+      </w:pPr>
+      <w:r>
+        <w:rPr>
+          <w:rFonts w:ascii="Times New Roman" w:hAnsi="Times New Roman" w:cs="Times New Roman"/>
+          <w:sz w:val="24"/>
+          <w:szCs w:val="24"/>
+        </w:rPr>
+        <w:t>Future research could extend this analysis in several directions. First, incorporating context-aware sentiment models, such as transformer-based language models, could improve measurement accuracy and better capture nuanced economic tone. Second, expanding the dataset to include additional outlets and a longer time horizon would allow for stronger inference and dynamic analysis around major economic or political events.</w:t>
+      </w:r>
+      <w:r>
+        <w:rPr>
+          <w:rFonts w:ascii="Times New Roman" w:hAnsi="Times New Roman" w:cs="Times New Roman"/>
+          <w:sz w:val="24"/>
+          <w:szCs w:val="24"/>
+        </w:rPr>
+        <w:t xml:space="preserve"> </w:t>
+      </w:r>
+      <w:r>
+        <w:rPr>
+          <w:rFonts w:ascii="Times New Roman" w:hAnsi="Times New Roman" w:cs="Times New Roman"/>
+          <w:sz w:val="24"/>
+          <w:szCs w:val="24"/>
+        </w:rPr>
+        <w:t>Finally, linking outlet-specific sentiment to consumer confidence or financial market outcomes would provide deeper insight into the real economic consequences of media framing.</w:t>
       </w:r>
     </w:p>
     <w:p>
       <w:pPr>
-        <w:numPr>
-          <w:ilvl w:val="0"/>
-          <w:numId w:val="12"/>
-        </w:numPr>
-        <w:tabs>
-          <w:tab w:val="num" w:pos="720"/>
-        </w:tabs>
-        <w:rPr>
-          <w:rFonts w:ascii="Times New Roman" w:hAnsi="Times New Roman" w:cs="Times New Roman"/>
-          <w:sz w:val="24"/>
-          <w:szCs w:val="24"/>
-        </w:rPr>
-      </w:pPr>
-      <w:r>
-        <w:rPr>
-          <w:rFonts w:ascii="Times New Roman" w:hAnsi="Times New Roman" w:cs="Times New Roman"/>
-          <w:b/>
-          <w:bCs/>
-          <w:sz w:val="24"/>
-          <w:szCs w:val="24"/>
-        </w:rPr>
-        <w:t>Political content influence:</w:t>
-      </w:r>
-      <w:r>
-        <w:rPr>
-          <w:rFonts w:ascii="Times New Roman" w:hAnsi="Times New Roman" w:cs="Times New Roman"/>
-          <w:sz w:val="24"/>
-          <w:szCs w:val="24"/>
-        </w:rPr>
-        <w:br/>
-        <w:t>Articles that do not mention Donald Trump generally exhibit higher positive sentiment in both outlets. When Trump is mentioned, sentiment declines, particularly in CNN coverage, while Fox News maintains a relatively higher positivity. This aligns with prior findings that Fox News frames Trump more favorably, whereas CNN tends to be more critical.</w:t>
-      </w:r>
+        <w:rPr>
+          <w:rFonts w:ascii="Times New Roman" w:hAnsi="Times New Roman" w:cs="Times New Roman"/>
+          <w:sz w:val="24"/>
+          <w:szCs w:val="24"/>
+        </w:rPr>
+      </w:pPr>
     </w:p>
     <w:p>
       <w:pPr>
-        <w:numPr>
-          <w:ilvl w:val="0"/>
-          <w:numId w:val="12"/>
-        </w:numPr>
-        <w:tabs>
-          <w:tab w:val="num" w:pos="720"/>
-        </w:tabs>
-        <w:rPr>
-          <w:rFonts w:ascii="Times New Roman" w:hAnsi="Times New Roman" w:cs="Times New Roman"/>
-          <w:sz w:val="24"/>
-          <w:szCs w:val="24"/>
-        </w:rPr>
-      </w:pPr>
-      <w:r>
-        <w:rPr>
-          <w:rFonts w:ascii="Times New Roman" w:hAnsi="Times New Roman" w:cs="Times New Roman"/>
-          <w:b/>
-          <w:bCs/>
-          <w:sz w:val="24"/>
-          <w:szCs w:val="24"/>
-        </w:rPr>
-        <w:t>Relationship with economic outcomes:</w:t>
-      </w:r>
-      <w:r>
-        <w:rPr>
-          <w:rFonts w:ascii="Times New Roman" w:hAnsi="Times New Roman" w:cs="Times New Roman"/>
-          <w:sz w:val="24"/>
-          <w:szCs w:val="24"/>
-        </w:rPr>
-        <w:br/>
-        <w:t>Despite a limited sample period, news sentiment closely tracks U.S. GDP growth trends, supporting the idea that media sentiment may provide timely information about economic conditions that is complementary to traditional indicators.</w:t>
-      </w:r>
+        <w:rPr>
+          <w:rFonts w:ascii="Times New Roman" w:hAnsi="Times New Roman" w:cs="Times New Roman"/>
+          <w:sz w:val="24"/>
+          <w:szCs w:val="24"/>
+        </w:rPr>
+      </w:pPr>
     </w:p>
     <w:p>
       <w:pPr>
@@ -4048,168 +4770,46 @@
       <w:pPr>
         <w:rPr>
           <w:rFonts w:ascii="Times New Roman" w:hAnsi="Times New Roman" w:cs="Times New Roman"/>
-          <w:b/>
-          <w:bCs/>
-          <w:sz w:val="24"/>
-          <w:szCs w:val="24"/>
-        </w:rPr>
-      </w:pPr>
-      <w:r>
-        <w:rPr>
-          <w:rFonts w:ascii="Times New Roman" w:hAnsi="Times New Roman" w:cs="Times New Roman"/>
-          <w:b/>
-          <w:bCs/>
-          <w:sz w:val="24"/>
-          <w:szCs w:val="24"/>
-        </w:rPr>
-        <w:t>Limitations</w:t>
-      </w:r>
+          <w:sz w:val="24"/>
+          <w:szCs w:val="24"/>
+        </w:rPr>
+      </w:pPr>
     </w:p>
     <w:p>
       <w:pPr>
-        <w:numPr>
-          <w:ilvl w:val="0"/>
-          <w:numId w:val="13"/>
-        </w:numPr>
-        <w:rPr>
-          <w:rFonts w:ascii="Times New Roman" w:hAnsi="Times New Roman" w:cs="Times New Roman"/>
-          <w:sz w:val="24"/>
-          <w:szCs w:val="24"/>
-        </w:rPr>
-      </w:pPr>
-      <w:r>
-        <w:rPr>
-          <w:rFonts w:ascii="Times New Roman" w:hAnsi="Times New Roman" w:cs="Times New Roman"/>
-          <w:b/>
-          <w:bCs/>
-          <w:sz w:val="24"/>
-          <w:szCs w:val="24"/>
-        </w:rPr>
-        <w:t>Lexicon-based sentiment:</w:t>
-      </w:r>
-      <w:r>
-        <w:rPr>
-          <w:rFonts w:ascii="Times New Roman" w:hAnsi="Times New Roman" w:cs="Times New Roman"/>
-          <w:sz w:val="24"/>
-          <w:szCs w:val="24"/>
-        </w:rPr>
-        <w:br/>
-        <w:t>The AFINN approach does not account for context, negation, or sarcasm, which may lead to under- or overestimation of true sentiment.</w:t>
-      </w:r>
+        <w:rPr>
+          <w:rFonts w:ascii="Times New Roman" w:hAnsi="Times New Roman" w:cs="Times New Roman"/>
+          <w:sz w:val="24"/>
+          <w:szCs w:val="24"/>
+        </w:rPr>
+      </w:pPr>
     </w:p>
     <w:p>
       <w:pPr>
-        <w:numPr>
-          <w:ilvl w:val="0"/>
-          <w:numId w:val="13"/>
-        </w:numPr>
-        <w:rPr>
-          <w:rFonts w:ascii="Times New Roman" w:hAnsi="Times New Roman" w:cs="Times New Roman"/>
-          <w:sz w:val="24"/>
-          <w:szCs w:val="24"/>
-        </w:rPr>
-      </w:pPr>
-      <w:r>
-        <w:rPr>
-          <w:rFonts w:ascii="Times New Roman" w:hAnsi="Times New Roman" w:cs="Times New Roman"/>
-          <w:b/>
-          <w:bCs/>
-          <w:sz w:val="24"/>
-          <w:szCs w:val="24"/>
-        </w:rPr>
-        <w:t>Limited media scope:</w:t>
-      </w:r>
-      <w:r>
-        <w:rPr>
-          <w:rFonts w:ascii="Times New Roman" w:hAnsi="Times New Roman" w:cs="Times New Roman"/>
-          <w:sz w:val="24"/>
-          <w:szCs w:val="24"/>
-        </w:rPr>
-        <w:br/>
-        <w:t>The analysis focuses only on CNN and Fox News, so results may not generalize to other outlets with different editorial policies or audience profiles.</w:t>
-      </w:r>
+        <w:rPr>
+          <w:rFonts w:ascii="Times New Roman" w:hAnsi="Times New Roman" w:cs="Times New Roman"/>
+          <w:sz w:val="24"/>
+          <w:szCs w:val="24"/>
+        </w:rPr>
+      </w:pPr>
     </w:p>
     <w:p>
       <w:pPr>
-        <w:numPr>
-          <w:ilvl w:val="0"/>
-          <w:numId w:val="13"/>
-        </w:numPr>
-        <w:rPr>
-          <w:rFonts w:ascii="Times New Roman" w:hAnsi="Times New Roman" w:cs="Times New Roman"/>
-          <w:sz w:val="24"/>
-          <w:szCs w:val="24"/>
-        </w:rPr>
-      </w:pPr>
-      <w:r>
-        <w:rPr>
-          <w:rFonts w:ascii="Times New Roman" w:hAnsi="Times New Roman" w:cs="Times New Roman"/>
-          <w:b/>
-          <w:bCs/>
-          <w:sz w:val="24"/>
-          <w:szCs w:val="24"/>
-        </w:rPr>
-        <w:t>Short time horizon:</w:t>
-      </w:r>
-      <w:r>
-        <w:rPr>
-          <w:rFonts w:ascii="Times New Roman" w:hAnsi="Times New Roman" w:cs="Times New Roman"/>
-          <w:sz w:val="24"/>
-          <w:szCs w:val="24"/>
-        </w:rPr>
-        <w:br/>
-        <w:t xml:space="preserve">The period analyzed for GDP </w:t>
-      </w:r>
-      <w:proofErr w:type="spellStart"/>
-      <w:r>
-        <w:rPr>
-          <w:rFonts w:ascii="Times New Roman" w:hAnsi="Times New Roman" w:cs="Times New Roman"/>
-          <w:sz w:val="24"/>
-          <w:szCs w:val="24"/>
-        </w:rPr>
-        <w:t>comovement</w:t>
-      </w:r>
-      <w:proofErr w:type="spellEnd"/>
-      <w:r>
-        <w:rPr>
-          <w:rFonts w:ascii="Times New Roman" w:hAnsi="Times New Roman" w:cs="Times New Roman"/>
-          <w:sz w:val="24"/>
-          <w:szCs w:val="24"/>
-        </w:rPr>
-        <w:t xml:space="preserve"> is limited, reducing the ability to assess long-term predictive power of media sentiment.</w:t>
-      </w:r>
+        <w:rPr>
+          <w:rFonts w:ascii="Times New Roman" w:hAnsi="Times New Roman" w:cs="Times New Roman"/>
+          <w:sz w:val="24"/>
+          <w:szCs w:val="24"/>
+        </w:rPr>
+      </w:pPr>
     </w:p>
     <w:p>
       <w:pPr>
-        <w:numPr>
-          <w:ilvl w:val="0"/>
-          <w:numId w:val="13"/>
-        </w:numPr>
-        <w:rPr>
-          <w:rFonts w:ascii="Times New Roman" w:hAnsi="Times New Roman" w:cs="Times New Roman"/>
-          <w:sz w:val="24"/>
-          <w:szCs w:val="24"/>
-        </w:rPr>
-      </w:pPr>
-      <w:r>
-        <w:rPr>
-          <w:rFonts w:ascii="Times New Roman" w:hAnsi="Times New Roman" w:cs="Times New Roman"/>
-          <w:b/>
-          <w:bCs/>
-          <w:sz w:val="24"/>
-          <w:szCs w:val="24"/>
-        </w:rPr>
-        <w:t>Article-level granularity:</w:t>
-      </w:r>
-      <w:r>
-        <w:rPr>
-          <w:rFonts w:ascii="Times New Roman" w:hAnsi="Times New Roman" w:cs="Times New Roman"/>
-          <w:sz w:val="24"/>
-          <w:szCs w:val="24"/>
-        </w:rPr>
-        <w:br/>
-        <w:t>Differences in article prominence, authorship, and audience reach are not considered, which may influence perceived framing and sentiment impact.</w:t>
-      </w:r>
+        <w:rPr>
+          <w:rFonts w:ascii="Times New Roman" w:hAnsi="Times New Roman" w:cs="Times New Roman"/>
+          <w:sz w:val="24"/>
+          <w:szCs w:val="24"/>
+        </w:rPr>
+      </w:pPr>
     </w:p>
     <w:p>
       <w:pPr>
@@ -4220,155 +4820,263 @@
         </w:rPr>
       </w:pPr>
     </w:p>
+    <w:sdt>
+      <w:sdtPr>
+        <w:rPr>
+          <w:rFonts w:cs="Times New Roman"/>
+        </w:rPr>
+        <w:id w:val="268744792"/>
+        <w:docPartObj>
+          <w:docPartGallery w:val="Bibliographies"/>
+          <w:docPartUnique/>
+        </w:docPartObj>
+      </w:sdtPr>
+      <w:sdtEndPr>
+        <w:rPr>
+          <w:rFonts w:asciiTheme="minorHAnsi" w:eastAsiaTheme="minorHAnsi" w:hAnsiTheme="minorHAnsi" w:cstheme="minorBidi"/>
+          <w:b w:val="0"/>
+          <w:color w:val="auto"/>
+          <w:sz w:val="22"/>
+          <w:szCs w:val="22"/>
+        </w:rPr>
+      </w:sdtEndPr>
+      <w:sdtContent>
+        <w:p>
+          <w:pPr>
+            <w:pStyle w:val="Heading1"/>
+            <w:rPr>
+              <w:rFonts w:cs="Times New Roman"/>
+            </w:rPr>
+          </w:pPr>
+          <w:r>
+            <w:rPr>
+              <w:rFonts w:cs="Times New Roman"/>
+            </w:rPr>
+            <w:t>References</w:t>
+          </w:r>
+        </w:p>
+        <w:sdt>
+          <w:sdtPr>
+            <w:rPr>
+              <w:rFonts w:ascii="Times New Roman" w:hAnsi="Times New Roman" w:cs="Times New Roman"/>
+            </w:rPr>
+            <w:id w:val="-573587230"/>
+            <w:bibliography/>
+          </w:sdtPr>
+          <w:sdtEndPr>
+            <w:rPr>
+              <w:rFonts w:asciiTheme="minorHAnsi" w:hAnsiTheme="minorHAnsi" w:cstheme="minorBidi"/>
+            </w:rPr>
+          </w:sdtEndPr>
+          <w:sdtContent>
+            <w:p>
+              <w:pPr>
+                <w:pStyle w:val="Bibliography"/>
+                <w:ind w:left="720" w:hanging="720"/>
+                <w:rPr>
+                  <w:rFonts w:ascii="Times New Roman" w:hAnsi="Times New Roman" w:cs="Times New Roman"/>
+                  <w:noProof/>
+                  <w:kern w:val="0"/>
+                  <w:sz w:val="24"/>
+                  <w:szCs w:val="24"/>
+                  <w14:ligatures w14:val="none"/>
+                </w:rPr>
+              </w:pPr>
+              <w:r>
+                <w:rPr>
+                  <w:rFonts w:ascii="Times New Roman" w:hAnsi="Times New Roman" w:cs="Times New Roman"/>
+                  <w:sz w:val="24"/>
+                  <w:szCs w:val="24"/>
+                </w:rPr>
+                <w:fldChar w:fldCharType="begin"/>
+              </w:r>
+              <w:r>
+                <w:rPr>
+                  <w:rFonts w:ascii="Times New Roman" w:hAnsi="Times New Roman" w:cs="Times New Roman"/>
+                  <w:sz w:val="24"/>
+                  <w:szCs w:val="24"/>
+                </w:rPr>
+                <w:instrText xml:space="preserve"> BIBLIOGRAPHY </w:instrText>
+              </w:r>
+              <w:r>
+                <w:rPr>
+                  <w:rFonts w:ascii="Times New Roman" w:hAnsi="Times New Roman" w:cs="Times New Roman"/>
+                  <w:sz w:val="24"/>
+                  <w:szCs w:val="24"/>
+                </w:rPr>
+                <w:fldChar w:fldCharType="separate"/>
+              </w:r>
+              <w:r>
+                <w:rPr>
+                  <w:rFonts w:ascii="Times New Roman" w:hAnsi="Times New Roman" w:cs="Times New Roman"/>
+                  <w:noProof/>
+                  <w:sz w:val="24"/>
+                  <w:szCs w:val="24"/>
+                </w:rPr>
+                <w:t>Nielsen, F. A. (2011). A new ANEW: Evaluation of a word list for sentiment analysis in microblogs. Proceedings of the Workshop on Making Sense of Microposts, ESWC.</w:t>
+              </w:r>
+            </w:p>
+            <w:p>
+              <w:pPr>
+                <w:pStyle w:val="Bibliography"/>
+                <w:ind w:left="720" w:hanging="720"/>
+                <w:rPr>
+                  <w:rFonts w:ascii="Times New Roman" w:hAnsi="Times New Roman" w:cs="Times New Roman"/>
+                  <w:noProof/>
+                  <w:sz w:val="24"/>
+                  <w:szCs w:val="24"/>
+                </w:rPr>
+              </w:pPr>
+              <w:r>
+                <w:rPr>
+                  <w:rFonts w:ascii="Times New Roman" w:hAnsi="Times New Roman" w:cs="Times New Roman"/>
+                  <w:noProof/>
+                  <w:sz w:val="24"/>
+                  <w:szCs w:val="24"/>
+                </w:rPr>
+                <w:t xml:space="preserve">Shi, H., Caddel, J., &amp; Lensing, J. (2019). Analyzing U.S. Army Officer Evaluation Reports with Natural Language Processing; A Log-Odds and Latent Dirichlet Allocation Exploration. </w:t>
+              </w:r>
+              <w:r>
+                <w:rPr>
+                  <w:rFonts w:ascii="Times New Roman" w:hAnsi="Times New Roman" w:cs="Times New Roman"/>
+                  <w:i/>
+                  <w:iCs/>
+                  <w:noProof/>
+                  <w:sz w:val="24"/>
+                  <w:szCs w:val="24"/>
+                </w:rPr>
+                <w:t>Industrial and Systems Engineering Review</w:t>
+              </w:r>
+              <w:r>
+                <w:rPr>
+                  <w:rFonts w:ascii="Times New Roman" w:hAnsi="Times New Roman" w:cs="Times New Roman"/>
+                  <w:noProof/>
+                  <w:sz w:val="24"/>
+                  <w:szCs w:val="24"/>
+                </w:rPr>
+                <w:t>.</w:t>
+              </w:r>
+            </w:p>
+            <w:p>
+              <w:pPr>
+                <w:rPr>
+                  <w:rFonts w:ascii="Times New Roman" w:hAnsi="Times New Roman" w:cs="Times New Roman"/>
+                  <w:noProof/>
+                  <w:sz w:val="24"/>
+                  <w:szCs w:val="24"/>
+                </w:rPr>
+              </w:pPr>
+              <w:r>
+                <w:rPr>
+                  <w:rFonts w:ascii="Times New Roman" w:hAnsi="Times New Roman" w:cs="Times New Roman"/>
+                  <w:noProof/>
+                  <w:sz w:val="24"/>
+                  <w:szCs w:val="24"/>
+                </w:rPr>
+                <w:fldChar w:fldCharType="end"/>
+              </w:r>
+              <w:r>
+                <w:rPr>
+                  <w:rFonts w:ascii="Times New Roman" w:hAnsi="Times New Roman" w:cs="Times New Roman"/>
+                  <w:noProof/>
+                  <w:sz w:val="24"/>
+                  <w:szCs w:val="24"/>
+                </w:rPr>
+                <w:t xml:space="preserve">CNN. (2025). CNN.com. </w:t>
+              </w:r>
+              <w:hyperlink r:id="rId12" w:history="1">
+                <w:r>
+                  <w:rPr>
+                    <w:rStyle w:val="Hyperlink"/>
+                    <w:rFonts w:ascii="Times New Roman" w:hAnsi="Times New Roman" w:cs="Times New Roman"/>
+                    <w:noProof/>
+                    <w:sz w:val="24"/>
+                    <w:szCs w:val="24"/>
+                  </w:rPr>
+                  <w:t>https://edition.cnn.com/</w:t>
+                </w:r>
+              </w:hyperlink>
+            </w:p>
+            <w:p>
+              <w:r>
+                <w:rPr>
+                  <w:rFonts w:ascii="Times New Roman" w:hAnsi="Times New Roman" w:cs="Times New Roman"/>
+                  <w:noProof/>
+                  <w:sz w:val="24"/>
+                  <w:szCs w:val="24"/>
+                </w:rPr>
+                <w:t xml:space="preserve">Fox News. (2025). FoxNews.com. </w:t>
+              </w:r>
+              <w:hyperlink r:id="rId13" w:history="1">
+                <w:r>
+                  <w:rPr>
+                    <w:rStyle w:val="Hyperlink"/>
+                    <w:rFonts w:ascii="Times New Roman" w:hAnsi="Times New Roman" w:cs="Times New Roman"/>
+                    <w:noProof/>
+                    <w:sz w:val="24"/>
+                    <w:szCs w:val="24"/>
+                  </w:rPr>
+                  <w:t>https://www.foxnews.com/</w:t>
+                </w:r>
+              </w:hyperlink>
+              <w:r>
+                <w:rPr>
+                  <w:rFonts w:ascii="Times New Roman" w:hAnsi="Times New Roman" w:cs="Times New Roman"/>
+                  <w:noProof/>
+                  <w:sz w:val="24"/>
+                  <w:szCs w:val="24"/>
+                </w:rPr>
+                <w:t xml:space="preserve"> </w:t>
+              </w:r>
+            </w:p>
+          </w:sdtContent>
+        </w:sdt>
+      </w:sdtContent>
+    </w:sdt>
     <w:p>
       <w:pPr>
         <w:rPr>
           <w:rFonts w:ascii="Times New Roman" w:hAnsi="Times New Roman" w:cs="Times New Roman"/>
-          <w:b/>
-          <w:bCs/>
-          <w:sz w:val="24"/>
-          <w:szCs w:val="24"/>
-        </w:rPr>
-      </w:pPr>
-      <w:r>
-        <w:rPr>
-          <w:rFonts w:ascii="Times New Roman" w:hAnsi="Times New Roman" w:cs="Times New Roman"/>
-          <w:b/>
-          <w:bCs/>
-          <w:sz w:val="24"/>
-          <w:szCs w:val="24"/>
-        </w:rPr>
-        <w:lastRenderedPageBreak/>
-        <w:t>Future Research</w:t>
-      </w:r>
+          <w:sz w:val="24"/>
+          <w:szCs w:val="24"/>
+        </w:rPr>
+      </w:pPr>
     </w:p>
     <w:p>
       <w:pPr>
-        <w:numPr>
-          <w:ilvl w:val="0"/>
-          <w:numId w:val="14"/>
-        </w:numPr>
-        <w:rPr>
-          <w:rFonts w:ascii="Times New Roman" w:hAnsi="Times New Roman" w:cs="Times New Roman"/>
-          <w:sz w:val="24"/>
-          <w:szCs w:val="24"/>
-        </w:rPr>
-      </w:pPr>
-      <w:r>
-        <w:rPr>
-          <w:rFonts w:ascii="Times New Roman" w:hAnsi="Times New Roman" w:cs="Times New Roman"/>
-          <w:b/>
-          <w:bCs/>
-          <w:sz w:val="24"/>
-          <w:szCs w:val="24"/>
-        </w:rPr>
-        <w:t>Alternative sentiment methods:</w:t>
-      </w:r>
-      <w:r>
-        <w:rPr>
-          <w:rFonts w:ascii="Times New Roman" w:hAnsi="Times New Roman" w:cs="Times New Roman"/>
-          <w:sz w:val="24"/>
-          <w:szCs w:val="24"/>
-        </w:rPr>
-        <w:br/>
-        <w:t>Using domain-specific lexicons or transformer-based models could better capture contextual nuance, negation, and subtleties in tone.</w:t>
-      </w:r>
+        <w:rPr>
+          <w:rFonts w:ascii="Times New Roman" w:hAnsi="Times New Roman" w:cs="Times New Roman"/>
+          <w:sz w:val="24"/>
+          <w:szCs w:val="24"/>
+        </w:rPr>
+      </w:pPr>
     </w:p>
     <w:p>
       <w:pPr>
-        <w:numPr>
-          <w:ilvl w:val="0"/>
-          <w:numId w:val="14"/>
-        </w:numPr>
-        <w:rPr>
-          <w:rFonts w:ascii="Times New Roman" w:hAnsi="Times New Roman" w:cs="Times New Roman"/>
-          <w:sz w:val="24"/>
-          <w:szCs w:val="24"/>
-        </w:rPr>
-      </w:pPr>
-      <w:r>
-        <w:rPr>
-          <w:rFonts w:ascii="Times New Roman" w:hAnsi="Times New Roman" w:cs="Times New Roman"/>
-          <w:b/>
-          <w:bCs/>
-          <w:sz w:val="24"/>
-          <w:szCs w:val="24"/>
-        </w:rPr>
-        <w:t>Broader media coverage:</w:t>
-      </w:r>
-      <w:r>
-        <w:rPr>
-          <w:rFonts w:ascii="Times New Roman" w:hAnsi="Times New Roman" w:cs="Times New Roman"/>
-          <w:sz w:val="24"/>
-          <w:szCs w:val="24"/>
-        </w:rPr>
-        <w:br/>
-        <w:t>Including additional news outlets would provide a more comprehensive understanding of media framing and ideological differences in economic reporting.</w:t>
-      </w:r>
+        <w:rPr>
+          <w:rFonts w:ascii="Times New Roman" w:hAnsi="Times New Roman" w:cs="Times New Roman"/>
+          <w:sz w:val="24"/>
+          <w:szCs w:val="24"/>
+        </w:rPr>
+      </w:pPr>
     </w:p>
     <w:p>
       <w:pPr>
-        <w:numPr>
-          <w:ilvl w:val="0"/>
-          <w:numId w:val="14"/>
-        </w:numPr>
-        <w:rPr>
-          <w:rFonts w:ascii="Times New Roman" w:hAnsi="Times New Roman" w:cs="Times New Roman"/>
-          <w:sz w:val="24"/>
-          <w:szCs w:val="24"/>
-        </w:rPr>
-      </w:pPr>
-      <w:r>
-        <w:rPr>
-          <w:rFonts w:ascii="Times New Roman" w:hAnsi="Times New Roman" w:cs="Times New Roman"/>
-          <w:b/>
-          <w:bCs/>
-          <w:sz w:val="24"/>
-          <w:szCs w:val="24"/>
-        </w:rPr>
-        <w:t>Longer and higher-frequency datasets:</w:t>
-      </w:r>
-      <w:r>
-        <w:rPr>
-          <w:rFonts w:ascii="Times New Roman" w:hAnsi="Times New Roman" w:cs="Times New Roman"/>
-          <w:sz w:val="24"/>
-          <w:szCs w:val="24"/>
-        </w:rPr>
-        <w:br/>
-        <w:t>Extending the analysis over longer periods and including higher-frequency economic indicators would improve insights into the predictive value of sentiment.</w:t>
-      </w:r>
+        <w:rPr>
+          <w:rFonts w:ascii="Times New Roman" w:hAnsi="Times New Roman" w:cs="Times New Roman"/>
+          <w:sz w:val="24"/>
+          <w:szCs w:val="24"/>
+        </w:rPr>
+      </w:pPr>
     </w:p>
     <w:p>
       <w:pPr>
-        <w:numPr>
-          <w:ilvl w:val="0"/>
-          <w:numId w:val="14"/>
-        </w:numPr>
-        <w:rPr>
-          <w:rFonts w:ascii="Times New Roman" w:hAnsi="Times New Roman" w:cs="Times New Roman"/>
-          <w:sz w:val="24"/>
-          <w:szCs w:val="24"/>
-        </w:rPr>
-      </w:pPr>
-      <w:r>
-        <w:rPr>
-          <w:rFonts w:ascii="Times New Roman" w:hAnsi="Times New Roman" w:cs="Times New Roman"/>
-          <w:b/>
-          <w:bCs/>
-          <w:sz w:val="24"/>
-          <w:szCs w:val="24"/>
-        </w:rPr>
-        <w:t>Causal analysis:</w:t>
-      </w:r>
-      <w:r>
-        <w:rPr>
-          <w:rFonts w:ascii="Times New Roman" w:hAnsi="Times New Roman" w:cs="Times New Roman"/>
-          <w:sz w:val="24"/>
-          <w:szCs w:val="24"/>
-        </w:rPr>
-        <w:br/>
-        <w:t>Future studies could explore whether changes in media sentiment influence economic expectations, consumer behavior, or market outcomes, moving beyond descriptive correlations.</w:t>
-      </w:r>
+        <w:rPr>
+          <w:rFonts w:ascii="Times New Roman" w:hAnsi="Times New Roman" w:cs="Times New Roman"/>
+          <w:sz w:val="24"/>
+          <w:szCs w:val="24"/>
+        </w:rPr>
+      </w:pPr>
     </w:p>
     <w:p>
       <w:pPr>
@@ -4555,7 +5263,7 @@
                     </pic:cNvPicPr>
                   </pic:nvPicPr>
                   <pic:blipFill>
-                    <a:blip r:embed="rId12">
+                    <a:blip r:embed="rId14">
                       <a:extLst>
                         <a:ext uri="{28A0092B-C50C-407E-A947-70E740481C1C}">
                           <a14:useLocalDpi xmlns:a14="http://schemas.microsoft.com/office/drawing/2010/main" val="0"/>
@@ -4609,6 +5317,95 @@
 <file path=word/numbering.xml><?xml version="1.0" encoding="utf-8"?>
 <w:numbering xmlns:wpc="http://schemas.microsoft.com/office/word/2010/wordprocessingCanvas" xmlns:cx="http://schemas.microsoft.com/office/drawing/2014/chartex" xmlns:cx1="http://schemas.microsoft.com/office/drawing/2015/9/8/chartex" xmlns:cx2="http://schemas.microsoft.com/office/drawing/2015/10/21/chartex" xmlns:cx3="http://schemas.microsoft.com/office/drawing/2016/5/9/chartex" xmlns:cx4="http://schemas.microsoft.com/office/drawing/2016/5/10/chartex" xmlns:cx5="http://schemas.microsoft.com/office/drawing/2016/5/11/chartex" xmlns:cx6="http://schemas.microsoft.com/office/drawing/2016/5/12/chartex" xmlns:cx7="http://schemas.microsoft.com/office/drawing/2016/5/13/chartex" xmlns:cx8="http://schemas.microsoft.com/office/drawing/2016/5/14/chartex" xmlns:mc="http://schemas.openxmlformats.org/markup-compatibility/2006" xmlns:aink="http://schemas.microsoft.com/office/drawing/2016/ink" xmlns:am3d="http://schemas.microsoft.com/office/drawing/2017/model3d" xmlns:o="urn:schemas-microsoft-com:office:office" xmlns:oel="http://schemas.microsoft.com/office/2019/extlst" xmlns:r="http://schemas.openxmlformats.org/officeDocument/2006/relationships" xmlns:m="http://schemas.openxmlformats.org/officeDocument/2006/math" xmlns:v="urn:schemas-microsoft-com:vml" xmlns:wp14="http://schemas.microsoft.com/office/word/2010/wordprocessingDrawing" xmlns:wp="http://schemas.openxmlformats.org/drawingml/2006/wordprocessingDrawing" xmlns:w10="urn:schemas-microsoft-com:office:word" xmlns:w="http://schemas.openxmlformats.org/wordprocessingml/2006/main" xmlns:w14="http://schemas.microsoft.com/office/word/2010/wordml" xmlns:w15="http://schemas.microsoft.com/office/word/2012/wordml" xmlns:w16cex="http://schemas.microsoft.com/office/word/2018/wordml/cex" xmlns:w16cid="http://schemas.microsoft.com/office/word/2016/wordml/cid" xmlns:w16="http://schemas.microsoft.com/office/word/2018/wordml" xmlns:w16du="http://schemas.microsoft.com/office/word/2023/wordml/word16du" xmlns:w16sdtdh="http://schemas.microsoft.com/office/word/2020/wordml/sdtdatahash" xmlns:w16sdtfl="http://schemas.microsoft.com/office/word/2024/wordml/sdtformatlock" xmlns:w16se="http://schemas.microsoft.com/office/word/2015/wordml/symex" xmlns:wpg="http://schemas.microsoft.com/office/word/2010/wordprocessingGroup" xmlns:wpi="http://schemas.microsoft.com/office/word/2010/wordprocessingInk" xmlns:wne="http://schemas.microsoft.com/office/word/2006/wordml" xmlns:wps="http://schemas.microsoft.com/office/word/2010/wordprocessingShape" mc:Ignorable="w14 w15 w16se w16cid w16 w16cex w16sdtdh w16sdtfl w16du wp14">
   <w:abstractNum w:abstractNumId="0" w15:restartNumberingAfterBreak="0">
+    <w:nsid w:val="0DCA3136"/>
+    <w:multiLevelType w:val="hybridMultilevel"/>
+    <w:tmpl w:val="E69C926A"/>
+    <w:lvl w:ilvl="0" w:tplc="0409000F">
+      <w:start w:val="1"/>
+      <w:numFmt w:val="decimal"/>
+      <w:lvlText w:val="%1."/>
+      <w:lvlJc w:val="left"/>
+      <w:pPr>
+        <w:ind w:left="360" w:hanging="360"/>
+      </w:pPr>
+      <w:rPr>
+        <w:rFonts w:hint="default"/>
+      </w:rPr>
+    </w:lvl>
+    <w:lvl w:ilvl="1" w:tplc="04090019" w:tentative="1">
+      <w:start w:val="1"/>
+      <w:numFmt w:val="lowerLetter"/>
+      <w:lvlText w:val="%2."/>
+      <w:lvlJc w:val="left"/>
+      <w:pPr>
+        <w:ind w:left="1080" w:hanging="360"/>
+      </w:pPr>
+    </w:lvl>
+    <w:lvl w:ilvl="2" w:tplc="0409001B" w:tentative="1">
+      <w:start w:val="1"/>
+      <w:numFmt w:val="lowerRoman"/>
+      <w:lvlText w:val="%3."/>
+      <w:lvlJc w:val="right"/>
+      <w:pPr>
+        <w:ind w:left="1800" w:hanging="180"/>
+      </w:pPr>
+    </w:lvl>
+    <w:lvl w:ilvl="3" w:tplc="0409000F" w:tentative="1">
+      <w:start w:val="1"/>
+      <w:numFmt w:val="decimal"/>
+      <w:lvlText w:val="%4."/>
+      <w:lvlJc w:val="left"/>
+      <w:pPr>
+        <w:ind w:left="2520" w:hanging="360"/>
+      </w:pPr>
+    </w:lvl>
+    <w:lvl w:ilvl="4" w:tplc="04090019" w:tentative="1">
+      <w:start w:val="1"/>
+      <w:numFmt w:val="lowerLetter"/>
+      <w:lvlText w:val="%5."/>
+      <w:lvlJc w:val="left"/>
+      <w:pPr>
+        <w:ind w:left="3240" w:hanging="360"/>
+      </w:pPr>
+    </w:lvl>
+    <w:lvl w:ilvl="5" w:tplc="0409001B" w:tentative="1">
+      <w:start w:val="1"/>
+      <w:numFmt w:val="lowerRoman"/>
+      <w:lvlText w:val="%6."/>
+      <w:lvlJc w:val="right"/>
+      <w:pPr>
+        <w:ind w:left="3960" w:hanging="180"/>
+      </w:pPr>
+    </w:lvl>
+    <w:lvl w:ilvl="6" w:tplc="0409000F" w:tentative="1">
+      <w:start w:val="1"/>
+      <w:numFmt w:val="decimal"/>
+      <w:lvlText w:val="%7."/>
+      <w:lvlJc w:val="left"/>
+      <w:pPr>
+        <w:ind w:left="4680" w:hanging="360"/>
+      </w:pPr>
+    </w:lvl>
+    <w:lvl w:ilvl="7" w:tplc="04090019" w:tentative="1">
+      <w:start w:val="1"/>
+      <w:numFmt w:val="lowerLetter"/>
+      <w:lvlText w:val="%8."/>
+      <w:lvlJc w:val="left"/>
+      <w:pPr>
+        <w:ind w:left="5400" w:hanging="360"/>
+      </w:pPr>
+    </w:lvl>
+    <w:lvl w:ilvl="8" w:tplc="0409001B" w:tentative="1">
+      <w:start w:val="1"/>
+      <w:numFmt w:val="lowerRoman"/>
+      <w:lvlText w:val="%9."/>
+      <w:lvlJc w:val="right"/>
+      <w:pPr>
+        <w:ind w:left="6120" w:hanging="180"/>
+      </w:pPr>
+    </w:lvl>
+  </w:abstractNum>
+  <w:abstractNum w:abstractNumId="1" w15:restartNumberingAfterBreak="0">
     <w:nsid w:val="116514AC"/>
     <w:multiLevelType w:val="multilevel"/>
     <w:tmpl w:val="6DF48F42"/>
@@ -4757,7 +5554,7 @@
       </w:rPr>
     </w:lvl>
   </w:abstractNum>
-  <w:abstractNum w:abstractNumId="1" w15:restartNumberingAfterBreak="0">
+  <w:abstractNum w:abstractNumId="2" w15:restartNumberingAfterBreak="0">
     <w:nsid w:val="123950EF"/>
     <w:multiLevelType w:val="multilevel"/>
     <w:tmpl w:val="48182AC6"/>
@@ -4906,7 +5703,7 @@
       </w:rPr>
     </w:lvl>
   </w:abstractNum>
-  <w:abstractNum w:abstractNumId="2" w15:restartNumberingAfterBreak="0">
+  <w:abstractNum w:abstractNumId="3" w15:restartNumberingAfterBreak="0">
     <w:nsid w:val="145650A2"/>
     <w:multiLevelType w:val="multilevel"/>
     <w:tmpl w:val="1D8E3888"/>
@@ -5055,7 +5852,7 @@
       </w:rPr>
     </w:lvl>
   </w:abstractNum>
-  <w:abstractNum w:abstractNumId="3" w15:restartNumberingAfterBreak="0">
+  <w:abstractNum w:abstractNumId="4" w15:restartNumberingAfterBreak="0">
     <w:nsid w:val="1CB760C1"/>
     <w:multiLevelType w:val="multilevel"/>
     <w:tmpl w:val="4F70EA38"/>
@@ -5204,7 +6001,7 @@
       </w:rPr>
     </w:lvl>
   </w:abstractNum>
-  <w:abstractNum w:abstractNumId="4" w15:restartNumberingAfterBreak="0">
+  <w:abstractNum w:abstractNumId="5" w15:restartNumberingAfterBreak="0">
     <w:nsid w:val="24964734"/>
     <w:multiLevelType w:val="multilevel"/>
     <w:tmpl w:val="C08EB0CE"/>
@@ -5353,7 +6150,7 @@
       </w:rPr>
     </w:lvl>
   </w:abstractNum>
-  <w:abstractNum w:abstractNumId="5" w15:restartNumberingAfterBreak="0">
+  <w:abstractNum w:abstractNumId="6" w15:restartNumberingAfterBreak="0">
     <w:nsid w:val="2579474E"/>
     <w:multiLevelType w:val="hybridMultilevel"/>
     <w:tmpl w:val="247283DE"/>
@@ -5442,7 +6239,7 @@
       </w:pPr>
     </w:lvl>
   </w:abstractNum>
-  <w:abstractNum w:abstractNumId="6" w15:restartNumberingAfterBreak="0">
+  <w:abstractNum w:abstractNumId="7" w15:restartNumberingAfterBreak="0">
     <w:nsid w:val="2D902358"/>
     <w:multiLevelType w:val="multilevel"/>
     <w:tmpl w:val="4A8C6596"/>
@@ -5591,7 +6388,7 @@
       </w:rPr>
     </w:lvl>
   </w:abstractNum>
-  <w:abstractNum w:abstractNumId="7" w15:restartNumberingAfterBreak="0">
+  <w:abstractNum w:abstractNumId="8" w15:restartNumberingAfterBreak="0">
     <w:nsid w:val="2E8B4BA2"/>
     <w:multiLevelType w:val="multilevel"/>
     <w:tmpl w:val="7BEC8DB6"/>
@@ -5740,7 +6537,7 @@
       </w:rPr>
     </w:lvl>
   </w:abstractNum>
-  <w:abstractNum w:abstractNumId="8" w15:restartNumberingAfterBreak="0">
+  <w:abstractNum w:abstractNumId="9" w15:restartNumberingAfterBreak="0">
     <w:nsid w:val="3EEF1024"/>
     <w:multiLevelType w:val="multilevel"/>
     <w:tmpl w:val="C0921A34"/>
@@ -5889,7 +6686,96 @@
       </w:rPr>
     </w:lvl>
   </w:abstractNum>
-  <w:abstractNum w:abstractNumId="9" w15:restartNumberingAfterBreak="0">
+  <w:abstractNum w:abstractNumId="10" w15:restartNumberingAfterBreak="0">
+    <w:nsid w:val="418F3C05"/>
+    <w:multiLevelType w:val="hybridMultilevel"/>
+    <w:tmpl w:val="C08E840E"/>
+    <w:lvl w:ilvl="0" w:tplc="1F94B546">
+      <w:start w:val="1"/>
+      <w:numFmt w:val="decimal"/>
+      <w:lvlText w:val="%1."/>
+      <w:lvlJc w:val="left"/>
+      <w:pPr>
+        <w:ind w:left="1080" w:hanging="360"/>
+      </w:pPr>
+      <w:rPr>
+        <w:rFonts w:hint="default"/>
+      </w:rPr>
+    </w:lvl>
+    <w:lvl w:ilvl="1" w:tplc="04090019" w:tentative="1">
+      <w:start w:val="1"/>
+      <w:numFmt w:val="lowerLetter"/>
+      <w:lvlText w:val="%2."/>
+      <w:lvlJc w:val="left"/>
+      <w:pPr>
+        <w:ind w:left="1800" w:hanging="360"/>
+      </w:pPr>
+    </w:lvl>
+    <w:lvl w:ilvl="2" w:tplc="0409001B" w:tentative="1">
+      <w:start w:val="1"/>
+      <w:numFmt w:val="lowerRoman"/>
+      <w:lvlText w:val="%3."/>
+      <w:lvlJc w:val="right"/>
+      <w:pPr>
+        <w:ind w:left="2520" w:hanging="180"/>
+      </w:pPr>
+    </w:lvl>
+    <w:lvl w:ilvl="3" w:tplc="0409000F" w:tentative="1">
+      <w:start w:val="1"/>
+      <w:numFmt w:val="decimal"/>
+      <w:lvlText w:val="%4."/>
+      <w:lvlJc w:val="left"/>
+      <w:pPr>
+        <w:ind w:left="3240" w:hanging="360"/>
+      </w:pPr>
+    </w:lvl>
+    <w:lvl w:ilvl="4" w:tplc="04090019" w:tentative="1">
+      <w:start w:val="1"/>
+      <w:numFmt w:val="lowerLetter"/>
+      <w:lvlText w:val="%5."/>
+      <w:lvlJc w:val="left"/>
+      <w:pPr>
+        <w:ind w:left="3960" w:hanging="360"/>
+      </w:pPr>
+    </w:lvl>
+    <w:lvl w:ilvl="5" w:tplc="0409001B" w:tentative="1">
+      <w:start w:val="1"/>
+      <w:numFmt w:val="lowerRoman"/>
+      <w:lvlText w:val="%6."/>
+      <w:lvlJc w:val="right"/>
+      <w:pPr>
+        <w:ind w:left="4680" w:hanging="180"/>
+      </w:pPr>
+    </w:lvl>
+    <w:lvl w:ilvl="6" w:tplc="0409000F" w:tentative="1">
+      <w:start w:val="1"/>
+      <w:numFmt w:val="decimal"/>
+      <w:lvlText w:val="%7."/>
+      <w:lvlJc w:val="left"/>
+      <w:pPr>
+        <w:ind w:left="5400" w:hanging="360"/>
+      </w:pPr>
+    </w:lvl>
+    <w:lvl w:ilvl="7" w:tplc="04090019" w:tentative="1">
+      <w:start w:val="1"/>
+      <w:numFmt w:val="lowerLetter"/>
+      <w:lvlText w:val="%8."/>
+      <w:lvlJc w:val="left"/>
+      <w:pPr>
+        <w:ind w:left="6120" w:hanging="360"/>
+      </w:pPr>
+    </w:lvl>
+    <w:lvl w:ilvl="8" w:tplc="0409001B" w:tentative="1">
+      <w:start w:val="1"/>
+      <w:numFmt w:val="lowerRoman"/>
+      <w:lvlText w:val="%9."/>
+      <w:lvlJc w:val="right"/>
+      <w:pPr>
+        <w:ind w:left="6840" w:hanging="180"/>
+      </w:pPr>
+    </w:lvl>
+  </w:abstractNum>
+  <w:abstractNum w:abstractNumId="11" w15:restartNumberingAfterBreak="0">
     <w:nsid w:val="560241C3"/>
     <w:multiLevelType w:val="multilevel"/>
     <w:tmpl w:val="25FE07C4"/>
@@ -6038,7 +6924,7 @@
       </w:rPr>
     </w:lvl>
   </w:abstractNum>
-  <w:abstractNum w:abstractNumId="10" w15:restartNumberingAfterBreak="0">
+  <w:abstractNum w:abstractNumId="12" w15:restartNumberingAfterBreak="0">
     <w:nsid w:val="587E15DE"/>
     <w:multiLevelType w:val="multilevel"/>
     <w:tmpl w:val="575E0C6C"/>
@@ -6187,7 +7073,7 @@
       </w:rPr>
     </w:lvl>
   </w:abstractNum>
-  <w:abstractNum w:abstractNumId="11" w15:restartNumberingAfterBreak="0">
+  <w:abstractNum w:abstractNumId="13" w15:restartNumberingAfterBreak="0">
     <w:nsid w:val="5D7235CC"/>
     <w:multiLevelType w:val="multilevel"/>
     <w:tmpl w:val="1E7001C6"/>
@@ -6336,7 +7222,7 @@
       </w:rPr>
     </w:lvl>
   </w:abstractNum>
-  <w:abstractNum w:abstractNumId="12" w15:restartNumberingAfterBreak="0">
+  <w:abstractNum w:abstractNumId="14" w15:restartNumberingAfterBreak="0">
     <w:nsid w:val="6982774D"/>
     <w:multiLevelType w:val="multilevel"/>
     <w:tmpl w:val="302A1D38"/>
@@ -6485,7 +7371,7 @@
       </w:rPr>
     </w:lvl>
   </w:abstractNum>
-  <w:abstractNum w:abstractNumId="13" w15:restartNumberingAfterBreak="0">
+  <w:abstractNum w:abstractNumId="15" w15:restartNumberingAfterBreak="0">
     <w:nsid w:val="7CD95D2A"/>
     <w:multiLevelType w:val="multilevel"/>
     <w:tmpl w:val="A0883226"/>
@@ -6635,46 +7521,52 @@
     </w:lvl>
   </w:abstractNum>
   <w:num w:numId="1" w16cid:durableId="840393291">
+    <w:abstractNumId w:val="6"/>
+  </w:num>
+  <w:num w:numId="2" w16cid:durableId="337511123">
+    <w:abstractNumId w:val="8"/>
+  </w:num>
+  <w:num w:numId="3" w16cid:durableId="543257021">
+    <w:abstractNumId w:val="3"/>
+  </w:num>
+  <w:num w:numId="4" w16cid:durableId="1030491383">
     <w:abstractNumId w:val="5"/>
   </w:num>
-  <w:num w:numId="2" w16cid:durableId="337511123">
+  <w:num w:numId="5" w16cid:durableId="741952154">
+    <w:abstractNumId w:val="2"/>
+  </w:num>
+  <w:num w:numId="6" w16cid:durableId="1616214029">
+    <w:abstractNumId w:val="9"/>
+  </w:num>
+  <w:num w:numId="7" w16cid:durableId="762840274">
+    <w:abstractNumId w:val="11"/>
+  </w:num>
+  <w:num w:numId="8" w16cid:durableId="1975209294">
+    <w:abstractNumId w:val="12"/>
+  </w:num>
+  <w:num w:numId="9" w16cid:durableId="878323290">
+    <w:abstractNumId w:val="15"/>
+  </w:num>
+  <w:num w:numId="10" w16cid:durableId="576138744">
+    <w:abstractNumId w:val="1"/>
+  </w:num>
+  <w:num w:numId="11" w16cid:durableId="1315067533">
     <w:abstractNumId w:val="7"/>
   </w:num>
-  <w:num w:numId="3" w16cid:durableId="543257021">
-    <w:abstractNumId w:val="2"/>
+  <w:num w:numId="12" w16cid:durableId="373116261">
+    <w:abstractNumId w:val="14"/>
   </w:num>
-  <w:num w:numId="4" w16cid:durableId="1030491383">
+  <w:num w:numId="13" w16cid:durableId="1003316467">
+    <w:abstractNumId w:val="13"/>
+  </w:num>
+  <w:num w:numId="14" w16cid:durableId="159007620">
     <w:abstractNumId w:val="4"/>
   </w:num>
-  <w:num w:numId="5" w16cid:durableId="741952154">
-    <w:abstractNumId w:val="1"/>
-  </w:num>
-  <w:num w:numId="6" w16cid:durableId="1616214029">
-    <w:abstractNumId w:val="8"/>
-  </w:num>
-  <w:num w:numId="7" w16cid:durableId="762840274">
-    <w:abstractNumId w:val="9"/>
-  </w:num>
-  <w:num w:numId="8" w16cid:durableId="1975209294">
-    <w:abstractNumId w:val="10"/>
-  </w:num>
-  <w:num w:numId="9" w16cid:durableId="878323290">
-    <w:abstractNumId w:val="13"/>
-  </w:num>
-  <w:num w:numId="10" w16cid:durableId="576138744">
+  <w:num w:numId="15" w16cid:durableId="1384713719">
     <w:abstractNumId w:val="0"/>
   </w:num>
-  <w:num w:numId="11" w16cid:durableId="1315067533">
-    <w:abstractNumId w:val="6"/>
-  </w:num>
-  <w:num w:numId="12" w16cid:durableId="373116261">
-    <w:abstractNumId w:val="12"/>
-  </w:num>
-  <w:num w:numId="13" w16cid:durableId="1003316467">
-    <w:abstractNumId w:val="11"/>
-  </w:num>
-  <w:num w:numId="14" w16cid:durableId="159007620">
-    <w:abstractNumId w:val="3"/>
+  <w:num w:numId="16" w16cid:durableId="877543668">
+    <w:abstractNumId w:val="10"/>
   </w:num>
 </w:numbering>
 </file>
@@ -7087,7 +7979,7 @@
     <w:link w:val="Heading1Char"/>
     <w:uiPriority w:val="9"/>
     <w:qFormat/>
-    <w:rsid w:val="00795C52"/>
+    <w:rsid w:val="000419C1"/>
     <w:pPr>
       <w:keepNext/>
       <w:keepLines/>
@@ -7098,7 +7990,7 @@
       <w:rFonts w:ascii="Times New Roman" w:eastAsiaTheme="majorEastAsia" w:hAnsi="Times New Roman" w:cstheme="majorBidi"/>
       <w:b/>
       <w:color w:val="000000" w:themeColor="text1"/>
-      <w:sz w:val="28"/>
+      <w:sz w:val="32"/>
       <w:szCs w:val="40"/>
     </w:rPr>
   </w:style>
@@ -7311,12 +8203,12 @@
     <w:basedOn w:val="DefaultParagraphFont"/>
     <w:link w:val="Heading1"/>
     <w:uiPriority w:val="9"/>
-    <w:rsid w:val="00795C52"/>
+    <w:rsid w:val="000419C1"/>
     <w:rPr>
       <w:rFonts w:ascii="Times New Roman" w:eastAsiaTheme="majorEastAsia" w:hAnsi="Times New Roman" w:cstheme="majorBidi"/>
       <w:b/>
       <w:color w:val="000000" w:themeColor="text1"/>
-      <w:sz w:val="28"/>
+      <w:sz w:val="32"/>
       <w:szCs w:val="40"/>
     </w:rPr>
   </w:style>
@@ -7750,6 +8642,14 @@
       </w:tcPr>
     </w:tblStylePr>
   </w:style>
+  <w:style w:type="paragraph" w:styleId="Bibliography">
+    <w:name w:val="Bibliography"/>
+    <w:basedOn w:val="Normal"/>
+    <w:next w:val="Normal"/>
+    <w:uiPriority w:val="37"/>
+    <w:unhideWhenUsed/>
+    <w:rsid w:val="00111781"/>
+  </w:style>
 </w:styles>
 </file>
 

</xml_diff>